<commit_message>
frontend api 구현 - 0819
</commit_message>
<xml_diff>
--- a/backend/app/services/docs_agent/S3/영업방문 결과보고서(기본형).docx
+++ b/backend/app/services/docs_agent/S3/영업방문 결과보고서(기본형).docx
@@ -1,6 +1,6 @@
 
 <file path=word/document.xml><?xml version="1.0" encoding="utf-8"?>
-<w:document xmlns:wpc="http://schemas.microsoft.com/office/word/2010/wordprocessingCanvas" xmlns:cx="http://schemas.microsoft.com/office/drawing/2014/chartex" xmlns:cx1="http://schemas.microsoft.com/office/drawing/2015/9/8/chartex" xmlns:cx2="http://schemas.microsoft.com/office/drawing/2015/10/21/chartex" xmlns:cx3="http://schemas.microsoft.com/office/drawing/2016/5/9/chartex" xmlns:cx4="http://schemas.microsoft.com/office/drawing/2016/5/10/chartex" xmlns:cx5="http://schemas.microsoft.com/office/drawing/2016/5/11/chartex" xmlns:cx6="http://schemas.microsoft.com/office/drawing/2016/5/12/chartex" xmlns:cx7="http://schemas.microsoft.com/office/drawing/2016/5/13/chartex" xmlns:cx8="http://schemas.microsoft.com/office/drawing/2016/5/14/chartex" xmlns:mc="http://schemas.openxmlformats.org/markup-compatibility/2006" xmlns:aink="http://schemas.microsoft.com/office/drawing/2016/ink" xmlns:am3d="http://schemas.microsoft.com/office/drawing/2017/model3d" xmlns:o="urn:schemas-microsoft-com:office:office" xmlns:r="http://schemas.openxmlformats.org/officeDocument/2006/relationships" xmlns:m="http://schemas.openxmlformats.org/officeDocument/2006/math" xmlns:v="urn:schemas-microsoft-com:vml" xmlns:wp14="http://schemas.microsoft.com/office/word/2010/wordprocessingDrawing" xmlns:wp="http://schemas.openxmlformats.org/drawingml/2006/wordprocessingDrawing" xmlns:w10="urn:schemas-microsoft-com:office:word" xmlns:w="http://schemas.openxmlformats.org/wordprocessingml/2006/main" xmlns:w14="http://schemas.microsoft.com/office/word/2010/wordml" xmlns:w15="http://schemas.microsoft.com/office/word/2012/wordml" xmlns:w16cex="http://schemas.microsoft.com/office/word/2018/wordml/cex" xmlns:w16cid="http://schemas.microsoft.com/office/word/2016/wordml/cid" xmlns:w16="http://schemas.microsoft.com/office/word/2018/wordml" xmlns:w16sdtdh="http://schemas.microsoft.com/office/word/2020/wordml/sdtdatahash" xmlns:w16se="http://schemas.microsoft.com/office/word/2015/wordml/symex" xmlns:wpg="http://schemas.microsoft.com/office/word/2010/wordprocessingGroup" xmlns:wpi="http://schemas.microsoft.com/office/word/2010/wordprocessingInk" xmlns:wne="http://schemas.microsoft.com/office/word/2006/wordml" xmlns:wps="http://schemas.microsoft.com/office/word/2010/wordprocessingShape" mc:Ignorable="w14 w15 w16se w16cid w16 w16cex w16sdtdh wp14">
+<w:document xmlns:wpc="http://schemas.microsoft.com/office/word/2010/wordprocessingCanvas" xmlns:cx="http://schemas.microsoft.com/office/drawing/2014/chartex" xmlns:cx1="http://schemas.microsoft.com/office/drawing/2015/9/8/chartex" xmlns:cx2="http://schemas.microsoft.com/office/drawing/2015/10/21/chartex" xmlns:cx3="http://schemas.microsoft.com/office/drawing/2016/5/9/chartex" xmlns:cx4="http://schemas.microsoft.com/office/drawing/2016/5/10/chartex" xmlns:cx5="http://schemas.microsoft.com/office/drawing/2016/5/11/chartex" xmlns:cx6="http://schemas.microsoft.com/office/drawing/2016/5/12/chartex" xmlns:cx7="http://schemas.microsoft.com/office/drawing/2016/5/13/chartex" xmlns:cx8="http://schemas.microsoft.com/office/drawing/2016/5/14/chartex" xmlns:mc="http://schemas.openxmlformats.org/markup-compatibility/2006" xmlns:aink="http://schemas.microsoft.com/office/drawing/2016/ink" xmlns:am3d="http://schemas.microsoft.com/office/drawing/2017/model3d" xmlns:o="urn:schemas-microsoft-com:office:office" xmlns:oel="http://schemas.microsoft.com/office/2019/extlst" xmlns:r="http://schemas.openxmlformats.org/officeDocument/2006/relationships" xmlns:m="http://schemas.openxmlformats.org/officeDocument/2006/math" xmlns:v="urn:schemas-microsoft-com:vml" xmlns:wp14="http://schemas.microsoft.com/office/word/2010/wordprocessingDrawing" xmlns:wp="http://schemas.openxmlformats.org/drawingml/2006/wordprocessingDrawing" xmlns:w10="urn:schemas-microsoft-com:office:word" xmlns:w="http://schemas.openxmlformats.org/wordprocessingml/2006/main" xmlns:w14="http://schemas.microsoft.com/office/word/2010/wordml" xmlns:w15="http://schemas.microsoft.com/office/word/2012/wordml" xmlns:w16cex="http://schemas.microsoft.com/office/word/2018/wordml/cex" xmlns:w16cid="http://schemas.microsoft.com/office/word/2016/wordml/cid" xmlns:w16="http://schemas.microsoft.com/office/word/2018/wordml" xmlns:w16du="http://schemas.microsoft.com/office/word/2023/wordml/word16du" xmlns:w16sdtdh="http://schemas.microsoft.com/office/word/2020/wordml/sdtdatahash" xmlns:w16sdtfl="http://schemas.microsoft.com/office/word/2024/wordml/sdtformatlock" xmlns:w16se="http://schemas.microsoft.com/office/word/2015/wordml/symex" xmlns:wpg="http://schemas.microsoft.com/office/word/2010/wordprocessingGroup" xmlns:wpi="http://schemas.microsoft.com/office/word/2010/wordprocessingInk" xmlns:wne="http://schemas.microsoft.com/office/word/2006/wordml" xmlns:wps="http://schemas.microsoft.com/office/word/2010/wordprocessingShape" mc:Ignorable="w14 w15 w16se w16cid w16 w16cex w16sdtdh w16sdtfl w16du wp14">
   <w:body>
     <w:tbl>
       <w:tblPr>
@@ -29,12 +29,6 @@
         <w:gridCol w:w="889"/>
       </w:tblGrid>
       <w:tr>
-        <w:tblPrEx>
-          <w:tblCellMar>
-            <w:top w:w="0" w:type="dxa"/>
-            <w:bottom w:w="0" w:type="dxa"/>
-          </w:tblCellMar>
-        </w:tblPrEx>
         <w:trPr>
           <w:trHeight w:hRule="exact" w:val="342"/>
           <w:jc w:val="center"/>
@@ -53,83 +47,67 @@
           </w:tcPr>
           <w:p>
             <w:pPr>
-              <w:pStyle w:val="a7"/>
-              <w:spacing w:line="240" w:lineRule="auto"/>
-              <w:rPr>
-                <w:rFonts w:ascii="Malgun Gothic" w:eastAsia="Malgun Gothic" w:hAnsi="Malgun Gothic" w:cs="Malgun Gothic"/>
+              <w:pStyle w:val="ac"/>
+              <w:spacing w:line="240" w:lineRule="auto"/>
+              <w:rPr>
+                <w:rFonts w:ascii="맑은 고딕" w:eastAsia="맑은 고딕" w:hAnsi="맑은 고딕" w:cs="맑은 고딕"/>
                 <w:b/>
                 <w:bCs/>
                 <w:sz w:val="40"/>
                 <w:szCs w:val="40"/>
               </w:rPr>
             </w:pPr>
-            <w:hyperlink r:id="rId6" w:history="1">
-              <w:r>
-                <w:rPr>
-                  <w:rStyle w:val="Hyperlink"/>
-                  <w:rFonts w:ascii="Malgun Gothic" w:eastAsia="Malgun Gothic" w:hAnsi="Malgun Gothic" w:cs="Malgun Gothic" w:hint="eastAsia"/>
-                  <w:b/>
-                  <w:bCs/>
-                  <w:color w:val="000000"/>
-                  <w:sz w:val="40"/>
-                  <w:szCs w:val="40"/>
-                  <w:u w:val="none"/>
-                </w:rPr>
-                <w:t>영업방문</w:t>
-              </w:r>
-              <w:r>
-                <w:rPr>
-                  <w:rStyle w:val="Hyperlink"/>
-                  <w:rFonts w:ascii="Malgun Gothic" w:eastAsia="Malgun Gothic" w:hAnsi="Malgun Gothic" w:cs="Malgun Gothic"/>
-                  <w:b/>
-                  <w:bCs/>
-                  <w:color w:val="000000"/>
-                  <w:sz w:val="40"/>
-                  <w:szCs w:val="40"/>
-                  <w:u w:val="none"/>
-                </w:rPr>
-                <w:t xml:space="preserve"> </w:t>
-              </w:r>
-              <w:r>
-                <w:rPr>
-                  <w:rStyle w:val="Hyperlink"/>
-                  <w:rFonts w:ascii="Malgun Gothic" w:eastAsia="Malgun Gothic" w:hAnsi="Malgun Gothic" w:cs="Malgun Gothic" w:hint="eastAsia"/>
-                  <w:b/>
-                  <w:bCs/>
-                  <w:color w:val="000000"/>
-                  <w:sz w:val="40"/>
-                  <w:szCs w:val="40"/>
-                  <w:u w:val="none"/>
-                </w:rPr>
-                <w:t>결</w:t>
-              </w:r>
-              <w:r>
-                <w:rPr>
-                  <w:rStyle w:val="Hyperlink"/>
-                  <w:rFonts w:ascii="Malgun Gothic" w:eastAsia="Malgun Gothic" w:hAnsi="Malgun Gothic" w:cs="Malgun Gothic" w:hint="eastAsia"/>
-                  <w:b/>
-                  <w:bCs/>
-                  <w:color w:val="000000"/>
-                  <w:sz w:val="40"/>
-                  <w:szCs w:val="40"/>
-                  <w:u w:val="none"/>
-                </w:rPr>
-                <w:t>과</w:t>
-              </w:r>
-              <w:r>
-                <w:rPr>
-                  <w:rStyle w:val="Hyperlink"/>
-                  <w:rFonts w:ascii="Malgun Gothic" w:eastAsia="Malgun Gothic" w:hAnsi="Malgun Gothic" w:cs="Malgun Gothic" w:hint="eastAsia"/>
-                  <w:b/>
-                  <w:bCs/>
-                  <w:color w:val="000000"/>
-                  <w:sz w:val="40"/>
-                  <w:szCs w:val="40"/>
-                  <w:u w:val="none"/>
-                </w:rPr>
-                <w:t>보고서</w:t>
-              </w:r>
-            </w:hyperlink>
+            <w:r>
+              <w:fldChar w:fldCharType="begin"/>
+            </w:r>
+            <w:r>
+              <w:instrText>HYPERLINK "http://www.yesform.com/z_n/forms/search.php?q=%BF%B5%BE%F7%B9%E6%B9%AE+%B0%E1%B0%FA%BA%B8%B0%ED%BC%AD"</w:instrText>
+            </w:r>
+            <w:r>
+              <w:fldChar w:fldCharType="separate"/>
+            </w:r>
+            <w:r>
+              <w:rPr>
+                <w:rStyle w:val="af"/>
+                <w:rFonts w:ascii="맑은 고딕" w:eastAsia="맑은 고딕" w:hAnsi="맑은 고딕" w:cs="맑은 고딕" w:hint="eastAsia"/>
+                <w:b/>
+                <w:bCs/>
+                <w:color w:val="000000"/>
+                <w:sz w:val="40"/>
+                <w:szCs w:val="40"/>
+                <w:u w:val="none"/>
+              </w:rPr>
+              <w:t>영업방문</w:t>
+            </w:r>
+            <w:r>
+              <w:rPr>
+                <w:rStyle w:val="af"/>
+                <w:rFonts w:ascii="맑은 고딕" w:eastAsia="맑은 고딕" w:hAnsi="맑은 고딕" w:cs="맑은 고딕"/>
+                <w:b/>
+                <w:bCs/>
+                <w:color w:val="000000"/>
+                <w:sz w:val="40"/>
+                <w:szCs w:val="40"/>
+                <w:u w:val="none"/>
+              </w:rPr>
+              <w:t xml:space="preserve"> </w:t>
+            </w:r>
+            <w:r>
+              <w:rPr>
+                <w:rStyle w:val="af"/>
+                <w:rFonts w:ascii="맑은 고딕" w:eastAsia="맑은 고딕" w:hAnsi="맑은 고딕" w:cs="맑은 고딕" w:hint="eastAsia"/>
+                <w:b/>
+                <w:bCs/>
+                <w:color w:val="000000"/>
+                <w:sz w:val="40"/>
+                <w:szCs w:val="40"/>
+                <w:u w:val="none"/>
+              </w:rPr>
+              <w:t>결과보고서</w:t>
+            </w:r>
+            <w:r>
+              <w:fldChar w:fldCharType="end"/>
+            </w:r>
           </w:p>
         </w:tc>
         <w:tc>
@@ -145,31 +123,33 @@
           </w:tcPr>
           <w:p>
             <w:pPr>
-              <w:pStyle w:val="a7"/>
+              <w:pStyle w:val="ac"/>
               <w:spacing w:line="240" w:lineRule="auto"/>
               <w:jc w:val="center"/>
               <w:rPr>
-                <w:rFonts w:ascii="Malgun Gothic" w:eastAsia="Malgun Gothic" w:hAnsi="Malgun Gothic" w:cs="Malgun Gothic"/>
-              </w:rPr>
-            </w:pPr>
-            <w:r>
-              <w:rPr>
-                <w:rFonts w:ascii="Malgun Gothic" w:eastAsia="Malgun Gothic" w:hAnsi="Malgun Gothic" w:cs="Malgun Gothic" w:hint="eastAsia"/>
+                <w:rFonts w:ascii="맑은 고딕" w:eastAsia="맑은 고딕" w:hAnsi="맑은 고딕" w:cs="맑은 고딕"/>
+              </w:rPr>
+            </w:pPr>
+            <w:proofErr w:type="gramStart"/>
+            <w:r>
+              <w:rPr>
+                <w:rFonts w:ascii="맑은 고딕" w:eastAsia="맑은 고딕" w:hAnsi="맑은 고딕" w:cs="맑은 고딕" w:hint="eastAsia"/>
               </w:rPr>
               <w:t>담</w:t>
             </w:r>
             <w:r>
               <w:rPr>
-                <w:rFonts w:ascii="Malgun Gothic" w:eastAsia="Malgun Gothic" w:hAnsi="Malgun Gothic" w:cs="Malgun Gothic"/>
+                <w:rFonts w:ascii="맑은 고딕" w:eastAsia="맑은 고딕" w:hAnsi="맑은 고딕" w:cs="맑은 고딕"/>
               </w:rPr>
               <w:t xml:space="preserve">  </w:t>
             </w:r>
             <w:r>
               <w:rPr>
-                <w:rFonts w:ascii="Malgun Gothic" w:eastAsia="Malgun Gothic" w:hAnsi="Malgun Gothic" w:cs="Malgun Gothic" w:hint="eastAsia"/>
+                <w:rFonts w:ascii="맑은 고딕" w:eastAsia="맑은 고딕" w:hAnsi="맑은 고딕" w:cs="맑은 고딕" w:hint="eastAsia"/>
               </w:rPr>
               <w:t>당</w:t>
             </w:r>
+            <w:proofErr w:type="gramEnd"/>
           </w:p>
         </w:tc>
         <w:tc>
@@ -185,11 +165,11 @@
           </w:tcPr>
           <w:p>
             <w:pPr>
-              <w:pStyle w:val="a7"/>
+              <w:pStyle w:val="ac"/>
               <w:spacing w:line="240" w:lineRule="auto"/>
               <w:jc w:val="center"/>
               <w:rPr>
-                <w:rFonts w:ascii="Malgun Gothic" w:eastAsia="Malgun Gothic" w:hAnsi="Malgun Gothic"/>
+                <w:rFonts w:ascii="맑은 고딕" w:eastAsia="맑은 고딕" w:hAnsi="맑은 고딕"/>
               </w:rPr>
             </w:pPr>
           </w:p>
@@ -207,11 +187,11 @@
           </w:tcPr>
           <w:p>
             <w:pPr>
-              <w:pStyle w:val="a7"/>
+              <w:pStyle w:val="ac"/>
               <w:spacing w:line="240" w:lineRule="auto"/>
               <w:jc w:val="center"/>
               <w:rPr>
-                <w:rFonts w:ascii="Malgun Gothic" w:eastAsia="Malgun Gothic" w:hAnsi="Malgun Gothic"/>
+                <w:rFonts w:ascii="맑은 고딕" w:eastAsia="맑은 고딕" w:hAnsi="맑은 고딕"/>
               </w:rPr>
             </w:pPr>
           </w:p>
@@ -229,23 +209,17 @@
           </w:tcPr>
           <w:p>
             <w:pPr>
-              <w:pStyle w:val="a7"/>
+              <w:pStyle w:val="ac"/>
               <w:spacing w:line="240" w:lineRule="auto"/>
               <w:jc w:val="center"/>
               <w:rPr>
-                <w:rFonts w:ascii="Malgun Gothic" w:eastAsia="Malgun Gothic" w:hAnsi="Malgun Gothic"/>
+                <w:rFonts w:ascii="맑은 고딕" w:eastAsia="맑은 고딕" w:hAnsi="맑은 고딕"/>
               </w:rPr>
             </w:pPr>
           </w:p>
         </w:tc>
       </w:tr>
       <w:tr>
-        <w:tblPrEx>
-          <w:tblCellMar>
-            <w:top w:w="0" w:type="dxa"/>
-            <w:bottom w:w="0" w:type="dxa"/>
-          </w:tblCellMar>
-        </w:tblPrEx>
         <w:trPr>
           <w:trHeight w:hRule="exact" w:val="796"/>
           <w:jc w:val="center"/>
@@ -268,7 +242,7 @@
               <w:adjustRightInd w:val="0"/>
               <w:jc w:val="left"/>
               <w:rPr>
-                <w:rFonts w:ascii="Malgun Gothic" w:eastAsia="Malgun Gothic" w:hAnsi="Malgun Gothic"/>
+                <w:rFonts w:ascii="맑은 고딕" w:eastAsia="맑은 고딕" w:hAnsi="맑은 고딕"/>
                 <w:color w:val="000000"/>
                 <w:kern w:val="0"/>
                 <w:sz w:val="18"/>
@@ -290,12 +264,12 @@
           </w:tcPr>
           <w:p>
             <w:pPr>
-              <w:pStyle w:val="a7"/>
+              <w:pStyle w:val="ac"/>
               <w:wordWrap/>
               <w:spacing w:line="240" w:lineRule="auto"/>
               <w:jc w:val="center"/>
               <w:rPr>
-                <w:rFonts w:ascii="Malgun Gothic" w:eastAsia="Malgun Gothic" w:hAnsi="Malgun Gothic"/>
+                <w:rFonts w:ascii="맑은 고딕" w:eastAsia="맑은 고딕" w:hAnsi="맑은 고딕"/>
               </w:rPr>
             </w:pPr>
           </w:p>
@@ -313,12 +287,12 @@
           </w:tcPr>
           <w:p>
             <w:pPr>
-              <w:pStyle w:val="a7"/>
+              <w:pStyle w:val="ac"/>
               <w:wordWrap/>
               <w:spacing w:line="240" w:lineRule="auto"/>
               <w:jc w:val="center"/>
               <w:rPr>
-                <w:rFonts w:ascii="Malgun Gothic" w:eastAsia="Malgun Gothic" w:hAnsi="Malgun Gothic"/>
+                <w:rFonts w:ascii="맑은 고딕" w:eastAsia="맑은 고딕" w:hAnsi="맑은 고딕"/>
               </w:rPr>
             </w:pPr>
           </w:p>
@@ -336,12 +310,12 @@
           </w:tcPr>
           <w:p>
             <w:pPr>
-              <w:pStyle w:val="a7"/>
+              <w:pStyle w:val="ac"/>
               <w:wordWrap/>
               <w:spacing w:line="240" w:lineRule="auto"/>
               <w:jc w:val="center"/>
               <w:rPr>
-                <w:rFonts w:ascii="Malgun Gothic" w:eastAsia="Malgun Gothic" w:hAnsi="Malgun Gothic"/>
+                <w:rFonts w:ascii="맑은 고딕" w:eastAsia="맑은 고딕" w:hAnsi="맑은 고딕"/>
               </w:rPr>
             </w:pPr>
           </w:p>
@@ -359,12 +333,12 @@
           </w:tcPr>
           <w:p>
             <w:pPr>
-              <w:pStyle w:val="a7"/>
+              <w:pStyle w:val="ac"/>
               <w:wordWrap/>
               <w:spacing w:line="240" w:lineRule="auto"/>
               <w:jc w:val="center"/>
               <w:rPr>
-                <w:rFonts w:ascii="Malgun Gothic" w:eastAsia="Malgun Gothic" w:hAnsi="Malgun Gothic"/>
+                <w:rFonts w:ascii="맑은 고딕" w:eastAsia="맑은 고딕" w:hAnsi="맑은 고딕"/>
               </w:rPr>
             </w:pPr>
           </w:p>
@@ -373,7 +347,7 @@
     </w:tbl>
     <w:p>
       <w:pPr>
-        <w:pStyle w:val="a"/>
+        <w:pStyle w:val="a3"/>
         <w:wordWrap/>
         <w:jc w:val="center"/>
         <w:rPr>
@@ -384,7 +358,7 @@
     </w:p>
     <w:p>
       <w:pPr>
-        <w:pStyle w:val="a7"/>
+        <w:pStyle w:val="ac"/>
         <w:spacing w:line="307" w:lineRule="auto"/>
         <w:rPr>
           <w:sz w:val="2"/>
@@ -394,10 +368,10 @@
     </w:p>
     <w:p>
       <w:pPr>
-        <w:pStyle w:val="a7"/>
+        <w:pStyle w:val="ac"/>
         <w:spacing w:line="192" w:lineRule="auto"/>
         <w:rPr>
-          <w:rFonts w:ascii="Malgun Gothic" w:eastAsia="Malgun Gothic" w:cs="Malgun Gothic"/>
+          <w:rFonts w:ascii="맑은 고딕" w:eastAsia="맑은 고딕" w:cs="맑은 고딕"/>
           <w:color w:val="FFFFFF"/>
         </w:rPr>
       </w:pPr>
@@ -405,7 +379,7 @@
       <w:bookmarkEnd w:id="0"/>
       <w:r>
         <w:rPr>
-          <w:rFonts w:ascii="Malgun Gothic" w:eastAsia="Malgun Gothic" w:cs="Malgun Gothic"/>
+          <w:rFonts w:ascii="맑은 고딕" w:eastAsia="맑은 고딕" w:cs="맑은 고딕"/>
           <w:color w:val="FFFFFF"/>
         </w:rPr>
         <w:t>y</w:t>
@@ -437,12 +411,6 @@
         <w:gridCol w:w="2977"/>
       </w:tblGrid>
       <w:tr>
-        <w:tblPrEx>
-          <w:tblCellMar>
-            <w:top w:w="0" w:type="dxa"/>
-            <w:bottom w:w="0" w:type="dxa"/>
-          </w:tblCellMar>
-        </w:tblPrEx>
         <w:trPr>
           <w:trHeight w:hRule="exact" w:val="406"/>
           <w:jc w:val="center"/>
@@ -461,100 +429,112 @@
           </w:tcPr>
           <w:p>
             <w:pPr>
-              <w:pStyle w:val="a7"/>
-              <w:spacing w:line="240" w:lineRule="auto"/>
-              <w:rPr>
-                <w:rFonts w:ascii="Malgun Gothic" w:eastAsia="Malgun Gothic" w:hAnsi="Malgun Gothic" w:cs="Malgun Gothic"/>
-              </w:rPr>
-            </w:pPr>
-            <w:r>
-              <w:rPr>
-                <w:rFonts w:ascii="Malgun Gothic" w:eastAsia="Malgun Gothic" w:hAnsi="Malgun Gothic" w:cs="Batang" w:hint="eastAsia"/>
+              <w:pStyle w:val="ac"/>
+              <w:spacing w:line="240" w:lineRule="auto"/>
+              <w:rPr>
+                <w:rFonts w:ascii="맑은 고딕" w:eastAsia="맑은 고딕" w:hAnsi="맑은 고딕" w:cs="맑은 고딕"/>
+              </w:rPr>
+            </w:pPr>
+            <w:r>
+              <w:rPr>
+                <w:rFonts w:ascii="맑은 고딕" w:eastAsia="맑은 고딕" w:hAnsi="맑은 고딕" w:cs="바탕" w:hint="eastAsia"/>
               </w:rPr>
               <w:t>■</w:t>
             </w:r>
             <w:r>
               <w:rPr>
-                <w:rFonts w:ascii="Malgun Gothic" w:eastAsia="Malgun Gothic" w:hAnsi="Malgun Gothic" w:cs="Malgun Gothic"/>
+                <w:rFonts w:ascii="맑은 고딕" w:eastAsia="맑은 고딕" w:hAnsi="맑은 고딕" w:cs="맑은 고딕"/>
               </w:rPr>
               <w:t xml:space="preserve"> </w:t>
             </w:r>
             <w:r>
               <w:rPr>
-                <w:rFonts w:ascii="Malgun Gothic" w:eastAsia="Malgun Gothic" w:hAnsi="Malgun Gothic" w:cs="Malgun Gothic" w:hint="eastAsia"/>
+                <w:rFonts w:ascii="맑은 고딕" w:eastAsia="맑은 고딕" w:hAnsi="맑은 고딕" w:cs="맑은 고딕" w:hint="eastAsia"/>
               </w:rPr>
               <w:t>방</w:t>
             </w:r>
             <w:r>
               <w:rPr>
-                <w:rFonts w:ascii="Malgun Gothic" w:eastAsia="Malgun Gothic" w:hAnsi="Malgun Gothic" w:cs="Malgun Gothic"/>
+                <w:rFonts w:ascii="맑은 고딕" w:eastAsia="맑은 고딕" w:hAnsi="맑은 고딕" w:cs="맑은 고딕"/>
               </w:rPr>
               <w:t xml:space="preserve"> </w:t>
             </w:r>
             <w:r>
               <w:rPr>
-                <w:rFonts w:ascii="Malgun Gothic" w:eastAsia="Malgun Gothic" w:hAnsi="Malgun Gothic" w:cs="Malgun Gothic" w:hint="eastAsia"/>
+                <w:rFonts w:ascii="맑은 고딕" w:eastAsia="맑은 고딕" w:hAnsi="맑은 고딕" w:cs="맑은 고딕" w:hint="eastAsia"/>
               </w:rPr>
               <w:t>문</w:t>
             </w:r>
             <w:r>
               <w:rPr>
-                <w:rFonts w:ascii="Malgun Gothic" w:eastAsia="Malgun Gothic" w:hAnsi="Malgun Gothic" w:cs="Malgun Gothic"/>
+                <w:rFonts w:ascii="맑은 고딕" w:eastAsia="맑은 고딕" w:hAnsi="맑은 고딕" w:cs="맑은 고딕"/>
               </w:rPr>
               <w:t xml:space="preserve"> </w:t>
             </w:r>
-            <w:r>
-              <w:rPr>
-                <w:rFonts w:ascii="Malgun Gothic" w:eastAsia="Malgun Gothic" w:hAnsi="Malgun Gothic" w:cs="Malgun Gothic" w:hint="eastAsia"/>
+            <w:proofErr w:type="gramStart"/>
+            <w:r>
+              <w:rPr>
+                <w:rFonts w:ascii="맑은 고딕" w:eastAsia="맑은 고딕" w:hAnsi="맑은 고딕" w:cs="맑은 고딕" w:hint="eastAsia"/>
               </w:rPr>
               <w:t>일</w:t>
             </w:r>
             <w:r>
               <w:rPr>
-                <w:rFonts w:ascii="Malgun Gothic" w:eastAsia="Malgun Gothic" w:hAnsi="Malgun Gothic" w:cs="Malgun Gothic"/>
-              </w:rPr>
-              <w:t xml:space="preserve"> : 20  </w:t>
-            </w:r>
-            <w:r>
-              <w:rPr>
-                <w:rFonts w:ascii="Malgun Gothic" w:eastAsia="Malgun Gothic" w:hAnsi="Malgun Gothic" w:cs="Malgun Gothic" w:hint="eastAsia"/>
+                <w:rFonts w:ascii="맑은 고딕" w:eastAsia="맑은 고딕" w:hAnsi="맑은 고딕" w:cs="맑은 고딕"/>
+              </w:rPr>
+              <w:t xml:space="preserve"> :</w:t>
+            </w:r>
+            <w:proofErr w:type="gramEnd"/>
+            <w:r>
+              <w:rPr>
+                <w:rFonts w:ascii="맑은 고딕" w:eastAsia="맑은 고딕" w:hAnsi="맑은 고딕" w:cs="맑은 고딕"/>
+              </w:rPr>
+              <w:t xml:space="preserve"> </w:t>
+            </w:r>
+            <w:proofErr w:type="gramStart"/>
+            <w:r>
+              <w:rPr>
+                <w:rFonts w:ascii="맑은 고딕" w:eastAsia="맑은 고딕" w:hAnsi="맑은 고딕" w:cs="맑은 고딕"/>
+              </w:rPr>
+              <w:t xml:space="preserve">20  </w:t>
+            </w:r>
+            <w:r>
+              <w:rPr>
+                <w:rFonts w:ascii="맑은 고딕" w:eastAsia="맑은 고딕" w:hAnsi="맑은 고딕" w:cs="맑은 고딕" w:hint="eastAsia"/>
               </w:rPr>
               <w:t>년</w:t>
             </w:r>
-            <w:r>
-              <w:rPr>
-                <w:rFonts w:ascii="Malgun Gothic" w:eastAsia="Malgun Gothic" w:hAnsi="Malgun Gothic" w:cs="Malgun Gothic"/>
+            <w:proofErr w:type="gramEnd"/>
+            <w:r>
+              <w:rPr>
+                <w:rFonts w:ascii="맑은 고딕" w:eastAsia="맑은 고딕" w:hAnsi="맑은 고딕" w:cs="맑은 고딕"/>
               </w:rPr>
               <w:t xml:space="preserve">  </w:t>
             </w:r>
-            <w:r>
-              <w:rPr>
-                <w:rFonts w:ascii="Malgun Gothic" w:eastAsia="Malgun Gothic" w:hAnsi="Malgun Gothic" w:cs="Malgun Gothic" w:hint="eastAsia"/>
+            <w:proofErr w:type="gramStart"/>
+            <w:r>
+              <w:rPr>
+                <w:rFonts w:ascii="맑은 고딕" w:eastAsia="맑은 고딕" w:hAnsi="맑은 고딕" w:cs="맑은 고딕" w:hint="eastAsia"/>
               </w:rPr>
               <w:t>월</w:t>
             </w:r>
             <w:r>
               <w:rPr>
-                <w:rFonts w:ascii="Malgun Gothic" w:eastAsia="Malgun Gothic" w:hAnsi="Malgun Gothic" w:cs="Malgun Gothic"/>
+                <w:rFonts w:ascii="맑은 고딕" w:eastAsia="맑은 고딕" w:hAnsi="맑은 고딕" w:cs="맑은 고딕"/>
               </w:rPr>
               <w:t xml:space="preserve">  </w:t>
             </w:r>
             <w:r>
               <w:rPr>
-                <w:rFonts w:ascii="Malgun Gothic" w:eastAsia="Malgun Gothic" w:hAnsi="Malgun Gothic" w:cs="Malgun Gothic" w:hint="eastAsia"/>
+                <w:rFonts w:ascii="맑은 고딕" w:eastAsia="맑은 고딕" w:hAnsi="맑은 고딕" w:cs="맑은 고딕" w:hint="eastAsia"/>
               </w:rPr>
               <w:t>일</w:t>
             </w:r>
+            <w:proofErr w:type="gramEnd"/>
           </w:p>
         </w:tc>
       </w:tr>
       <w:tr>
-        <w:tblPrEx>
-          <w:tblCellMar>
-            <w:top w:w="0" w:type="dxa"/>
-            <w:bottom w:w="0" w:type="dxa"/>
-          </w:tblCellMar>
-        </w:tblPrEx>
         <w:trPr>
           <w:trHeight w:hRule="exact" w:val="406"/>
           <w:jc w:val="center"/>
@@ -573,17 +553,17 @@
           </w:tcPr>
           <w:p>
             <w:pPr>
-              <w:pStyle w:val="a7"/>
+              <w:pStyle w:val="ac"/>
               <w:wordWrap/>
               <w:spacing w:line="240" w:lineRule="auto"/>
               <w:jc w:val="center"/>
               <w:rPr>
-                <w:rFonts w:ascii="Malgun Gothic" w:eastAsia="Malgun Gothic" w:hAnsi="Malgun Gothic" w:cs="Malgun Gothic"/>
-              </w:rPr>
-            </w:pPr>
-            <w:r>
-              <w:rPr>
-                <w:rFonts w:ascii="Malgun Gothic" w:eastAsia="Malgun Gothic" w:hAnsi="Malgun Gothic" w:cs="Malgun Gothic" w:hint="eastAsia"/>
+                <w:rFonts w:ascii="맑은 고딕" w:eastAsia="맑은 고딕" w:hAnsi="맑은 고딕" w:cs="맑은 고딕"/>
+              </w:rPr>
+            </w:pPr>
+            <w:r>
+              <w:rPr>
+                <w:rFonts w:ascii="맑은 고딕" w:eastAsia="맑은 고딕" w:hAnsi="맑은 고딕" w:cs="맑은 고딕" w:hint="eastAsia"/>
               </w:rPr>
               <w:t>방문제목</w:t>
             </w:r>
@@ -603,23 +583,17 @@
           </w:tcPr>
           <w:p>
             <w:pPr>
-              <w:pStyle w:val="a7"/>
+              <w:pStyle w:val="ac"/>
               <w:spacing w:line="240" w:lineRule="auto"/>
               <w:ind w:left="100" w:right="100"/>
               <w:rPr>
-                <w:rFonts w:ascii="Malgun Gothic" w:eastAsia="Malgun Gothic" w:hAnsi="Malgun Gothic"/>
+                <w:rFonts w:ascii="맑은 고딕" w:eastAsia="맑은 고딕" w:hAnsi="맑은 고딕"/>
               </w:rPr>
             </w:pPr>
           </w:p>
         </w:tc>
       </w:tr>
       <w:tr>
-        <w:tblPrEx>
-          <w:tblCellMar>
-            <w:top w:w="0" w:type="dxa"/>
-            <w:bottom w:w="0" w:type="dxa"/>
-          </w:tblCellMar>
-        </w:tblPrEx>
         <w:trPr>
           <w:trHeight w:hRule="exact" w:val="406"/>
           <w:jc w:val="center"/>
@@ -638,19 +612,19 @@
           </w:tcPr>
           <w:p>
             <w:pPr>
-              <w:pStyle w:val="a7"/>
+              <w:pStyle w:val="ac"/>
               <w:wordWrap/>
               <w:spacing w:line="240" w:lineRule="auto"/>
               <w:jc w:val="center"/>
               <w:rPr>
-                <w:rFonts w:ascii="Malgun Gothic" w:eastAsia="Malgun Gothic" w:hAnsi="Malgun Gothic" w:cs="Malgun Gothic"/>
-              </w:rPr>
-            </w:pPr>
-            <w:r>
-              <w:rPr>
-                <w:rFonts w:ascii="Malgun Gothic" w:eastAsia="Malgun Gothic" w:hAnsi="Malgun Gothic" w:cs="Malgun Gothic"/>
-              </w:rPr>
-              <w:t>Client</w:t>
+                <w:rFonts w:ascii="맑은 고딕" w:eastAsia="맑은 고딕" w:hAnsi="맑은 고딕" w:cs="맑은 고딕"/>
+              </w:rPr>
+            </w:pPr>
+            <w:r>
+              <w:rPr>
+                <w:rFonts w:ascii="맑은 고딕" w:eastAsia="맑은 고딕" w:hAnsi="맑은 고딕" w:cs="맑은 고딕" w:hint="eastAsia"/>
+              </w:rPr>
+              <w:t>병 원 명</w:t>
             </w:r>
           </w:p>
         </w:tc>
@@ -667,11 +641,11 @@
           </w:tcPr>
           <w:p>
             <w:pPr>
-              <w:pStyle w:val="a7"/>
+              <w:pStyle w:val="ac"/>
               <w:spacing w:line="240" w:lineRule="auto"/>
               <w:ind w:left="100" w:right="100"/>
               <w:rPr>
-                <w:rFonts w:ascii="Malgun Gothic" w:eastAsia="Malgun Gothic" w:hAnsi="Malgun Gothic"/>
+                <w:rFonts w:ascii="맑은 고딕" w:eastAsia="맑은 고딕" w:hAnsi="맑은 고딕"/>
               </w:rPr>
             </w:pPr>
           </w:p>
@@ -690,24 +664,18 @@
           </w:tcPr>
           <w:p>
             <w:pPr>
-              <w:pStyle w:val="a7"/>
+              <w:pStyle w:val="ac"/>
               <w:spacing w:line="240" w:lineRule="auto"/>
               <w:jc w:val="center"/>
               <w:rPr>
-                <w:rFonts w:ascii="Malgun Gothic" w:eastAsia="Malgun Gothic" w:hAnsi="Malgun Gothic" w:cs="Malgun Gothic"/>
-              </w:rPr>
-            </w:pPr>
-            <w:r>
-              <w:rPr>
-                <w:rFonts w:ascii="Malgun Gothic" w:eastAsia="Malgun Gothic" w:hAnsi="Malgun Gothic" w:cs="Malgun Gothic" w:hint="eastAsia"/>
-              </w:rPr>
-              <w:t>방문</w:t>
-            </w:r>
-            <w:r>
-              <w:rPr>
-                <w:rFonts w:ascii="Malgun Gothic" w:eastAsia="Malgun Gothic" w:hAnsi="Malgun Gothic" w:cs="Malgun Gothic"/>
-              </w:rPr>
-              <w:t xml:space="preserve"> Site</w:t>
+                <w:rFonts w:ascii="맑은 고딕" w:eastAsia="맑은 고딕" w:hAnsi="맑은 고딕" w:cs="맑은 고딕"/>
+              </w:rPr>
+            </w:pPr>
+            <w:r>
+              <w:rPr>
+                <w:rFonts w:ascii="맑은 고딕" w:eastAsia="맑은 고딕" w:hAnsi="맑은 고딕" w:cs="맑은 고딕" w:hint="eastAsia"/>
+              </w:rPr>
+              <w:t>지 역 구</w:t>
             </w:r>
           </w:p>
         </w:tc>
@@ -724,23 +692,17 @@
           </w:tcPr>
           <w:p>
             <w:pPr>
-              <w:pStyle w:val="a7"/>
+              <w:pStyle w:val="ac"/>
               <w:spacing w:line="240" w:lineRule="auto"/>
               <w:ind w:left="100" w:right="100"/>
               <w:rPr>
-                <w:rFonts w:ascii="Malgun Gothic" w:eastAsia="Malgun Gothic" w:hAnsi="Malgun Gothic"/>
+                <w:rFonts w:ascii="맑은 고딕" w:eastAsia="맑은 고딕" w:hAnsi="맑은 고딕"/>
               </w:rPr>
             </w:pPr>
           </w:p>
         </w:tc>
       </w:tr>
       <w:tr>
-        <w:tblPrEx>
-          <w:tblCellMar>
-            <w:top w:w="0" w:type="dxa"/>
-            <w:bottom w:w="0" w:type="dxa"/>
-          </w:tblCellMar>
-        </w:tblPrEx>
         <w:trPr>
           <w:trHeight w:hRule="exact" w:val="406"/>
           <w:jc w:val="center"/>
@@ -748,7 +710,6 @@
         <w:tc>
           <w:tcPr>
             <w:tcW w:w="1529" w:type="dxa"/>
-            <w:vMerge w:val="restart"/>
             <w:tcBorders>
               <w:top w:val="dotted" w:sz="6" w:space="0" w:color="A0A0A0"/>
               <w:left w:val="single" w:sz="6" w:space="0" w:color="EDF0FA"/>
@@ -760,43 +721,19 @@
           </w:tcPr>
           <w:p>
             <w:pPr>
-              <w:pStyle w:val="a7"/>
+              <w:pStyle w:val="ac"/>
               <w:wordWrap/>
               <w:spacing w:line="240" w:lineRule="auto"/>
               <w:jc w:val="center"/>
               <w:rPr>
-                <w:rFonts w:ascii="Malgun Gothic" w:eastAsia="Malgun Gothic" w:hAnsi="Malgun Gothic" w:cs="Malgun Gothic"/>
-              </w:rPr>
-            </w:pPr>
-            <w:r>
-              <w:rPr>
-                <w:rFonts w:ascii="Malgun Gothic" w:eastAsia="Malgun Gothic" w:hAnsi="Malgun Gothic" w:cs="Malgun Gothic" w:hint="eastAsia"/>
-              </w:rPr>
-              <w:t>담</w:t>
-            </w:r>
-            <w:r>
-              <w:rPr>
-                <w:rFonts w:ascii="Malgun Gothic" w:eastAsia="Malgun Gothic" w:hAnsi="Malgun Gothic" w:cs="Malgun Gothic"/>
-              </w:rPr>
-              <w:t xml:space="preserve"> </w:t>
-            </w:r>
-            <w:r>
-              <w:rPr>
-                <w:rFonts w:ascii="Malgun Gothic" w:eastAsia="Malgun Gothic" w:hAnsi="Malgun Gothic" w:cs="Malgun Gothic" w:hint="eastAsia"/>
-              </w:rPr>
-              <w:t>당</w:t>
-            </w:r>
-            <w:r>
-              <w:rPr>
-                <w:rFonts w:ascii="Malgun Gothic" w:eastAsia="Malgun Gothic" w:hAnsi="Malgun Gothic" w:cs="Malgun Gothic"/>
-              </w:rPr>
-              <w:t xml:space="preserve"> </w:t>
-            </w:r>
-            <w:r>
-              <w:rPr>
-                <w:rFonts w:ascii="Malgun Gothic" w:eastAsia="Malgun Gothic" w:hAnsi="Malgun Gothic" w:cs="Malgun Gothic" w:hint="eastAsia"/>
-              </w:rPr>
-              <w:t>자</w:t>
+                <w:rFonts w:ascii="맑은 고딕" w:eastAsia="맑은 고딕" w:hAnsi="맑은 고딕" w:cs="맑은 고딕"/>
+              </w:rPr>
+            </w:pPr>
+            <w:r>
+              <w:rPr>
+                <w:rFonts w:ascii="맑은 고딕" w:eastAsia="맑은 고딕" w:hAnsi="맑은 고딕" w:cs="맑은 고딕" w:hint="eastAsia"/>
+              </w:rPr>
+              <w:t>원 장 명</w:t>
             </w:r>
           </w:p>
         </w:tc>
@@ -813,11 +750,11 @@
           </w:tcPr>
           <w:p>
             <w:pPr>
-              <w:pStyle w:val="a7"/>
+              <w:pStyle w:val="ac"/>
               <w:spacing w:line="240" w:lineRule="auto"/>
               <w:ind w:left="100" w:right="100"/>
               <w:rPr>
-                <w:rFonts w:ascii="Malgun Gothic" w:eastAsia="Malgun Gothic" w:hAnsi="Malgun Gothic"/>
+                <w:rFonts w:ascii="맑은 고딕" w:eastAsia="맑은 고딕" w:hAnsi="맑은 고딕"/>
               </w:rPr>
             </w:pPr>
           </w:p>
@@ -836,30 +773,44 @@
           </w:tcPr>
           <w:p>
             <w:pPr>
-              <w:pStyle w:val="a7"/>
+              <w:pStyle w:val="ac"/>
               <w:spacing w:line="240" w:lineRule="auto"/>
               <w:jc w:val="center"/>
               <w:rPr>
-                <w:rFonts w:ascii="Malgun Gothic" w:eastAsia="Malgun Gothic" w:hAnsi="Malgun Gothic" w:cs="Malgun Gothic"/>
-              </w:rPr>
-            </w:pPr>
-            <w:r>
-              <w:rPr>
-                <w:rFonts w:ascii="Malgun Gothic" w:eastAsia="Malgun Gothic" w:hAnsi="Malgun Gothic" w:cs="Malgun Gothic" w:hint="eastAsia"/>
-              </w:rPr>
-              <w:t>소</w:t>
-            </w:r>
-            <w:r>
-              <w:rPr>
-                <w:rFonts w:ascii="Malgun Gothic" w:eastAsia="Malgun Gothic" w:hAnsi="Malgun Gothic" w:cs="Malgun Gothic"/>
-              </w:rPr>
-              <w:t xml:space="preserve">    </w:t>
-            </w:r>
-            <w:r>
-              <w:rPr>
-                <w:rFonts w:ascii="Malgun Gothic" w:eastAsia="Malgun Gothic" w:hAnsi="Malgun Gothic" w:cs="Malgun Gothic" w:hint="eastAsia"/>
-              </w:rPr>
-              <w:t>속</w:t>
+                <w:rFonts w:ascii="맑은 고딕" w:eastAsia="맑은 고딕" w:hAnsi="맑은 고딕" w:cs="맑은 고딕"/>
+              </w:rPr>
+            </w:pPr>
+            <w:r>
+              <w:rPr>
+                <w:rFonts w:ascii="맑은 고딕" w:eastAsia="맑은 고딕" w:hAnsi="맑은 고딕" w:cs="맑은 고딕" w:hint="eastAsia"/>
+              </w:rPr>
+              <w:t>연</w:t>
+            </w:r>
+            <w:r>
+              <w:rPr>
+                <w:rFonts w:ascii="맑은 고딕" w:eastAsia="맑은 고딕" w:hAnsi="맑은 고딕" w:cs="맑은 고딕" w:hint="eastAsia"/>
+              </w:rPr>
+              <w:t xml:space="preserve"> </w:t>
+            </w:r>
+            <w:proofErr w:type="spellStart"/>
+            <w:r>
+              <w:rPr>
+                <w:rFonts w:ascii="맑은 고딕" w:eastAsia="맑은 고딕" w:hAnsi="맑은 고딕" w:cs="맑은 고딕" w:hint="eastAsia"/>
+              </w:rPr>
+              <w:t>락</w:t>
+            </w:r>
+            <w:proofErr w:type="spellEnd"/>
+            <w:r>
+              <w:rPr>
+                <w:rFonts w:ascii="맑은 고딕" w:eastAsia="맑은 고딕" w:hAnsi="맑은 고딕" w:cs="맑은 고딕" w:hint="eastAsia"/>
+              </w:rPr>
+              <w:t xml:space="preserve"> </w:t>
+            </w:r>
+            <w:r>
+              <w:rPr>
+                <w:rFonts w:ascii="맑은 고딕" w:eastAsia="맑은 고딕" w:hAnsi="맑은 고딕" w:cs="맑은 고딕" w:hint="eastAsia"/>
+              </w:rPr>
+              <w:t>처</w:t>
             </w:r>
           </w:p>
         </w:tc>
@@ -876,23 +827,17 @@
           </w:tcPr>
           <w:p>
             <w:pPr>
-              <w:pStyle w:val="a7"/>
+              <w:pStyle w:val="ac"/>
               <w:spacing w:line="240" w:lineRule="auto"/>
               <w:ind w:left="100" w:right="100"/>
               <w:rPr>
-                <w:rFonts w:ascii="Malgun Gothic" w:eastAsia="Malgun Gothic" w:hAnsi="Malgun Gothic"/>
+                <w:rFonts w:ascii="맑은 고딕" w:eastAsia="맑은 고딕" w:hAnsi="맑은 고딕"/>
               </w:rPr>
             </w:pPr>
           </w:p>
         </w:tc>
       </w:tr>
       <w:tr>
-        <w:tblPrEx>
-          <w:tblCellMar>
-            <w:top w:w="0" w:type="dxa"/>
-            <w:bottom w:w="0" w:type="dxa"/>
-          </w:tblCellMar>
-        </w:tblPrEx>
         <w:trPr>
           <w:trHeight w:hRule="exact" w:val="406"/>
           <w:jc w:val="center"/>
@@ -900,7 +845,252 @@
         <w:tc>
           <w:tcPr>
             <w:tcW w:w="1529" w:type="dxa"/>
+            <w:vMerge w:val="restart"/>
+            <w:tcBorders>
+              <w:top w:val="dotted" w:sz="6" w:space="0" w:color="A0A0A0"/>
+              <w:left w:val="single" w:sz="6" w:space="0" w:color="EDF0FA"/>
+              <w:right w:val="dotted" w:sz="6" w:space="0" w:color="A0A0A0"/>
+            </w:tcBorders>
+            <w:shd w:val="solid" w:color="EDF0FA" w:fill="auto"/>
+            <w:vAlign w:val="center"/>
+          </w:tcPr>
+          <w:p>
+            <w:pPr>
+              <w:wordWrap/>
+              <w:adjustRightInd w:val="0"/>
+              <w:jc w:val="center"/>
+              <w:rPr>
+                <w:sz w:val="18"/>
+                <w:szCs w:val="18"/>
+              </w:rPr>
+            </w:pPr>
+            <w:r>
+              <w:rPr>
+                <w:rFonts w:ascii="맑은 고딕" w:eastAsia="맑은 고딕" w:hAnsi="맑은 고딕" w:cs="맑은 고딕" w:hint="eastAsia"/>
+                <w:sz w:val="18"/>
+                <w:szCs w:val="18"/>
+              </w:rPr>
+              <w:t>담 당 자</w:t>
+            </w:r>
+          </w:p>
+        </w:tc>
+        <w:tc>
+          <w:tcPr>
+            <w:tcW w:w="2921" w:type="dxa"/>
+            <w:tcBorders>
+              <w:top w:val="dotted" w:sz="6" w:space="0" w:color="A0A0A0"/>
+              <w:left w:val="dotted" w:sz="6" w:space="0" w:color="A0A0A0"/>
+              <w:bottom w:val="dotted" w:sz="6" w:space="0" w:color="A0A0A0"/>
+              <w:right w:val="dotted" w:sz="6" w:space="0" w:color="A0A0A0"/>
+            </w:tcBorders>
+            <w:vAlign w:val="center"/>
+          </w:tcPr>
+          <w:p>
+            <w:pPr>
+              <w:pStyle w:val="ac"/>
+              <w:spacing w:line="240" w:lineRule="auto"/>
+              <w:ind w:left="100" w:right="100"/>
+              <w:rPr>
+                <w:rFonts w:ascii="맑은 고딕" w:eastAsia="맑은 고딕" w:hAnsi="맑은 고딕"/>
+              </w:rPr>
+            </w:pPr>
+          </w:p>
+        </w:tc>
+        <w:tc>
+          <w:tcPr>
+            <w:tcW w:w="1558" w:type="dxa"/>
+            <w:tcBorders>
+              <w:top w:val="dotted" w:sz="6" w:space="0" w:color="A0A0A0"/>
+              <w:left w:val="dotted" w:sz="6" w:space="0" w:color="A0A0A0"/>
+              <w:bottom w:val="dotted" w:sz="6" w:space="0" w:color="A0A0A0"/>
+              <w:right w:val="dotted" w:sz="6" w:space="0" w:color="A0A0A0"/>
+            </w:tcBorders>
+            <w:shd w:val="solid" w:color="EDF0FA" w:fill="auto"/>
+            <w:vAlign w:val="center"/>
+          </w:tcPr>
+          <w:p>
+            <w:pPr>
+              <w:pStyle w:val="ac"/>
+              <w:spacing w:line="240" w:lineRule="auto"/>
+              <w:jc w:val="center"/>
+              <w:rPr>
+                <w:rFonts w:ascii="맑은 고딕" w:eastAsia="맑은 고딕" w:hAnsi="맑은 고딕" w:cs="맑은 고딕"/>
+              </w:rPr>
+            </w:pPr>
+            <w:r>
+              <w:rPr>
+                <w:rFonts w:ascii="맑은 고딕" w:eastAsia="맑은 고딕" w:hAnsi="맑은 고딕" w:cs="맑은 고딕" w:hint="eastAsia"/>
+              </w:rPr>
+              <w:t>부    서</w:t>
+            </w:r>
+            <w:r>
+              <w:rPr>
+                <w:rFonts w:ascii="맑은 고딕" w:eastAsia="맑은 고딕" w:hAnsi="맑은 고딕" w:cs="맑은 고딕" w:hint="eastAsia"/>
+              </w:rPr>
+              <w:t xml:space="preserve"> </w:t>
+            </w:r>
+          </w:p>
+        </w:tc>
+        <w:tc>
+          <w:tcPr>
+            <w:tcW w:w="2977" w:type="dxa"/>
+            <w:tcBorders>
+              <w:top w:val="dotted" w:sz="6" w:space="0" w:color="A0A0A0"/>
+              <w:left w:val="dotted" w:sz="6" w:space="0" w:color="A0A0A0"/>
+              <w:bottom w:val="dotted" w:sz="6" w:space="0" w:color="A0A0A0"/>
+              <w:right w:val="nil"/>
+            </w:tcBorders>
+            <w:vAlign w:val="center"/>
+          </w:tcPr>
+          <w:p>
+            <w:pPr>
+              <w:pStyle w:val="ac"/>
+              <w:spacing w:line="240" w:lineRule="auto"/>
+              <w:ind w:left="100" w:right="100"/>
+              <w:rPr>
+                <w:rFonts w:ascii="맑은 고딕" w:eastAsia="맑은 고딕" w:hAnsi="맑은 고딕"/>
+              </w:rPr>
+            </w:pPr>
+          </w:p>
+        </w:tc>
+      </w:tr>
+      <w:tr>
+        <w:trPr>
+          <w:trHeight w:hRule="exact" w:val="406"/>
+          <w:jc w:val="center"/>
+        </w:trPr>
+        <w:tc>
+          <w:tcPr>
+            <w:tcW w:w="1529" w:type="dxa"/>
             <w:vMerge/>
+            <w:tcBorders>
+              <w:left w:val="single" w:sz="6" w:space="0" w:color="EDF0FA"/>
+              <w:bottom w:val="dotted" w:sz="6" w:space="0" w:color="A0A0A0"/>
+              <w:right w:val="dotted" w:sz="6" w:space="0" w:color="A0A0A0"/>
+            </w:tcBorders>
+            <w:shd w:val="solid" w:color="EDF0FA" w:fill="auto"/>
+            <w:vAlign w:val="center"/>
+          </w:tcPr>
+          <w:p>
+            <w:pPr>
+              <w:pStyle w:val="ac"/>
+              <w:wordWrap/>
+              <w:spacing w:line="240" w:lineRule="auto"/>
+              <w:jc w:val="center"/>
+              <w:rPr>
+                <w:rFonts w:ascii="맑은 고딕" w:eastAsia="맑은 고딕" w:hAnsi="맑은 고딕" w:cs="맑은 고딕"/>
+              </w:rPr>
+            </w:pPr>
+          </w:p>
+        </w:tc>
+        <w:tc>
+          <w:tcPr>
+            <w:tcW w:w="2921" w:type="dxa"/>
+            <w:tcBorders>
+              <w:top w:val="dotted" w:sz="6" w:space="0" w:color="A0A0A0"/>
+              <w:left w:val="dotted" w:sz="6" w:space="0" w:color="A0A0A0"/>
+              <w:bottom w:val="dotted" w:sz="6" w:space="0" w:color="A0A0A0"/>
+              <w:right w:val="dotted" w:sz="6" w:space="0" w:color="A0A0A0"/>
+            </w:tcBorders>
+            <w:vAlign w:val="center"/>
+          </w:tcPr>
+          <w:p>
+            <w:pPr>
+              <w:pStyle w:val="ac"/>
+              <w:spacing w:line="240" w:lineRule="auto"/>
+              <w:ind w:left="100" w:right="100"/>
+              <w:rPr>
+                <w:rFonts w:ascii="맑은 고딕" w:eastAsia="맑은 고딕" w:hAnsi="맑은 고딕"/>
+              </w:rPr>
+            </w:pPr>
+          </w:p>
+        </w:tc>
+        <w:tc>
+          <w:tcPr>
+            <w:tcW w:w="1558" w:type="dxa"/>
+            <w:tcBorders>
+              <w:top w:val="dotted" w:sz="6" w:space="0" w:color="A0A0A0"/>
+              <w:left w:val="dotted" w:sz="6" w:space="0" w:color="A0A0A0"/>
+              <w:bottom w:val="dotted" w:sz="6" w:space="0" w:color="A0A0A0"/>
+              <w:right w:val="dotted" w:sz="6" w:space="0" w:color="A0A0A0"/>
+            </w:tcBorders>
+            <w:shd w:val="solid" w:color="EDF0FA" w:fill="auto"/>
+            <w:vAlign w:val="center"/>
+          </w:tcPr>
+          <w:p>
+            <w:pPr>
+              <w:pStyle w:val="ac"/>
+              <w:spacing w:line="240" w:lineRule="auto"/>
+              <w:jc w:val="center"/>
+              <w:rPr>
+                <w:rFonts w:ascii="맑은 고딕" w:eastAsia="맑은 고딕" w:hAnsi="맑은 고딕" w:cs="맑은 고딕"/>
+              </w:rPr>
+            </w:pPr>
+            <w:r>
+              <w:rPr>
+                <w:rFonts w:ascii="맑은 고딕" w:eastAsia="맑은 고딕" w:hAnsi="맑은 고딕" w:cs="맑은 고딕" w:hint="eastAsia"/>
+              </w:rPr>
+              <w:t>연</w:t>
+            </w:r>
+            <w:r>
+              <w:rPr>
+                <w:rFonts w:ascii="맑은 고딕" w:eastAsia="맑은 고딕" w:hAnsi="맑은 고딕" w:cs="맑은 고딕"/>
+              </w:rPr>
+              <w:t xml:space="preserve"> </w:t>
+            </w:r>
+            <w:proofErr w:type="spellStart"/>
+            <w:r>
+              <w:rPr>
+                <w:rFonts w:ascii="맑은 고딕" w:eastAsia="맑은 고딕" w:hAnsi="맑은 고딕" w:cs="맑은 고딕" w:hint="eastAsia"/>
+              </w:rPr>
+              <w:t>락</w:t>
+            </w:r>
+            <w:proofErr w:type="spellEnd"/>
+            <w:r>
+              <w:rPr>
+                <w:rFonts w:ascii="맑은 고딕" w:eastAsia="맑은 고딕" w:hAnsi="맑은 고딕" w:cs="맑은 고딕"/>
+              </w:rPr>
+              <w:t xml:space="preserve"> </w:t>
+            </w:r>
+            <w:r>
+              <w:rPr>
+                <w:rFonts w:ascii="맑은 고딕" w:eastAsia="맑은 고딕" w:hAnsi="맑은 고딕" w:cs="맑은 고딕" w:hint="eastAsia"/>
+              </w:rPr>
+              <w:t>처</w:t>
+            </w:r>
+          </w:p>
+        </w:tc>
+        <w:tc>
+          <w:tcPr>
+            <w:tcW w:w="2977" w:type="dxa"/>
+            <w:tcBorders>
+              <w:top w:val="dotted" w:sz="6" w:space="0" w:color="A0A0A0"/>
+              <w:left w:val="dotted" w:sz="6" w:space="0" w:color="A0A0A0"/>
+              <w:bottom w:val="dotted" w:sz="6" w:space="0" w:color="A0A0A0"/>
+              <w:right w:val="nil"/>
+            </w:tcBorders>
+            <w:vAlign w:val="center"/>
+          </w:tcPr>
+          <w:p>
+            <w:pPr>
+              <w:pStyle w:val="ac"/>
+              <w:spacing w:line="240" w:lineRule="auto"/>
+              <w:ind w:left="100" w:right="100"/>
+              <w:rPr>
+                <w:rFonts w:ascii="맑은 고딕" w:eastAsia="맑은 고딕" w:hAnsi="맑은 고딕"/>
+              </w:rPr>
+            </w:pPr>
+          </w:p>
+        </w:tc>
+      </w:tr>
+      <w:tr>
+        <w:trPr>
+          <w:trHeight w:hRule="exact" w:val="406"/>
+          <w:jc w:val="center"/>
+        </w:trPr>
+        <w:tc>
+          <w:tcPr>
+            <w:tcW w:w="1529" w:type="dxa"/>
             <w:tcBorders>
               <w:top w:val="dotted" w:sz="6" w:space="0" w:color="A0A0A0"/>
               <w:left w:val="single" w:sz="6" w:space="0" w:color="EDF0FA"/>
@@ -912,17 +1102,20 @@
           </w:tcPr>
           <w:p>
             <w:pPr>
+              <w:pStyle w:val="ac"/>
               <w:wordWrap/>
-              <w:adjustRightInd w:val="0"/>
-              <w:jc w:val="left"/>
-              <w:rPr>
-                <w:rFonts w:ascii="Malgun Gothic" w:eastAsia="Malgun Gothic" w:hAnsi="Malgun Gothic"/>
-                <w:color w:val="000000"/>
-                <w:kern w:val="0"/>
-                <w:sz w:val="18"/>
-                <w:szCs w:val="18"/>
-              </w:rPr>
-            </w:pPr>
+              <w:spacing w:line="240" w:lineRule="auto"/>
+              <w:jc w:val="center"/>
+              <w:rPr>
+                <w:rFonts w:ascii="맑은 고딕" w:eastAsia="맑은 고딕" w:hAnsi="맑은 고딕" w:cs="맑은 고딕"/>
+              </w:rPr>
+            </w:pPr>
+            <w:r>
+              <w:rPr>
+                <w:rFonts w:ascii="맑은 고딕" w:eastAsia="맑은 고딕" w:hAnsi="맑은 고딕" w:cs="맑은 고딕" w:hint="eastAsia"/>
+              </w:rPr>
+              <w:t>지    점</w:t>
+            </w:r>
           </w:p>
         </w:tc>
         <w:tc>
@@ -938,11 +1131,11 @@
           </w:tcPr>
           <w:p>
             <w:pPr>
-              <w:pStyle w:val="a7"/>
+              <w:pStyle w:val="ac"/>
               <w:spacing w:line="240" w:lineRule="auto"/>
               <w:ind w:left="100" w:right="100"/>
               <w:rPr>
-                <w:rFonts w:ascii="Malgun Gothic" w:eastAsia="Malgun Gothic" w:hAnsi="Malgun Gothic"/>
+                <w:rFonts w:ascii="맑은 고딕" w:eastAsia="맑은 고딕" w:hAnsi="맑은 고딕"/>
               </w:rPr>
             </w:pPr>
           </w:p>
@@ -961,40 +1154,42 @@
           </w:tcPr>
           <w:p>
             <w:pPr>
-              <w:pStyle w:val="a7"/>
+              <w:pStyle w:val="ac"/>
               <w:spacing w:line="240" w:lineRule="auto"/>
               <w:jc w:val="center"/>
               <w:rPr>
-                <w:rFonts w:ascii="Malgun Gothic" w:eastAsia="Malgun Gothic" w:hAnsi="Malgun Gothic" w:cs="Malgun Gothic"/>
-              </w:rPr>
-            </w:pPr>
-            <w:r>
-              <w:rPr>
-                <w:rFonts w:ascii="Malgun Gothic" w:eastAsia="Malgun Gothic" w:hAnsi="Malgun Gothic" w:cs="Malgun Gothic" w:hint="eastAsia"/>
+                <w:rFonts w:ascii="맑은 고딕" w:eastAsia="맑은 고딕" w:hAnsi="맑은 고딕" w:cs="맑은 고딕"/>
+              </w:rPr>
+            </w:pPr>
+            <w:r>
+              <w:rPr>
+                <w:rFonts w:ascii="맑은 고딕" w:eastAsia="맑은 고딕" w:hAnsi="맑은 고딕" w:cs="맑은 고딕" w:hint="eastAsia"/>
               </w:rPr>
               <w:t>연</w:t>
             </w:r>
             <w:r>
               <w:rPr>
-                <w:rFonts w:ascii="Malgun Gothic" w:eastAsia="Malgun Gothic" w:hAnsi="Malgun Gothic" w:cs="Malgun Gothic"/>
+                <w:rFonts w:ascii="맑은 고딕" w:eastAsia="맑은 고딕" w:hAnsi="맑은 고딕" w:cs="맑은 고딕"/>
               </w:rPr>
               <w:t xml:space="preserve"> </w:t>
             </w:r>
-            <w:r>
-              <w:rPr>
-                <w:rFonts w:ascii="Malgun Gothic" w:eastAsia="Malgun Gothic" w:hAnsi="Malgun Gothic" w:cs="Malgun Gothic" w:hint="eastAsia"/>
+            <w:proofErr w:type="spellStart"/>
+            <w:r>
+              <w:rPr>
+                <w:rFonts w:ascii="맑은 고딕" w:eastAsia="맑은 고딕" w:hAnsi="맑은 고딕" w:cs="맑은 고딕" w:hint="eastAsia"/>
               </w:rPr>
               <w:t>락</w:t>
             </w:r>
-            <w:r>
-              <w:rPr>
-                <w:rFonts w:ascii="Malgun Gothic" w:eastAsia="Malgun Gothic" w:hAnsi="Malgun Gothic" w:cs="Malgun Gothic"/>
+            <w:proofErr w:type="spellEnd"/>
+            <w:r>
+              <w:rPr>
+                <w:rFonts w:ascii="맑은 고딕" w:eastAsia="맑은 고딕" w:hAnsi="맑은 고딕" w:cs="맑은 고딕"/>
               </w:rPr>
               <w:t xml:space="preserve"> </w:t>
             </w:r>
             <w:r>
               <w:rPr>
-                <w:rFonts w:ascii="Malgun Gothic" w:eastAsia="Malgun Gothic" w:hAnsi="Malgun Gothic" w:cs="Malgun Gothic" w:hint="eastAsia"/>
+                <w:rFonts w:ascii="맑은 고딕" w:eastAsia="맑은 고딕" w:hAnsi="맑은 고딕" w:cs="맑은 고딕" w:hint="eastAsia"/>
               </w:rPr>
               <w:t>처</w:t>
             </w:r>
@@ -1013,138 +1208,142 @@
           </w:tcPr>
           <w:p>
             <w:pPr>
-              <w:pStyle w:val="a7"/>
+              <w:pStyle w:val="ac"/>
               <w:spacing w:line="240" w:lineRule="auto"/>
               <w:ind w:left="100" w:right="100"/>
               <w:rPr>
-                <w:rFonts w:ascii="Malgun Gothic" w:eastAsia="Malgun Gothic" w:hAnsi="Malgun Gothic"/>
+                <w:rFonts w:ascii="맑은 고딕" w:eastAsia="맑은 고딕" w:hAnsi="맑은 고딕"/>
               </w:rPr>
             </w:pPr>
           </w:p>
         </w:tc>
       </w:tr>
       <w:tr>
-        <w:tblPrEx>
-          <w:tblCellMar>
-            <w:top w:w="0" w:type="dxa"/>
-            <w:bottom w:w="0" w:type="dxa"/>
-          </w:tblCellMar>
-        </w:tblPrEx>
         <w:trPr>
           <w:trHeight w:hRule="exact" w:val="406"/>
           <w:jc w:val="center"/>
         </w:trPr>
         <w:tc>
           <w:tcPr>
-            <w:tcW w:w="1529" w:type="dxa"/>
+            <w:tcW w:w="8985" w:type="dxa"/>
+            <w:gridSpan w:val="4"/>
             <w:tcBorders>
               <w:top w:val="dotted" w:sz="6" w:space="0" w:color="A0A0A0"/>
               <w:left w:val="single" w:sz="6" w:space="0" w:color="EDF0FA"/>
               <w:bottom w:val="dotted" w:sz="6" w:space="0" w:color="A0A0A0"/>
-              <w:right w:val="dotted" w:sz="6" w:space="0" w:color="A0A0A0"/>
+              <w:right w:val="single" w:sz="6" w:space="0" w:color="EDF0FA"/>
             </w:tcBorders>
             <w:shd w:val="solid" w:color="EDF0FA" w:fill="auto"/>
             <w:vAlign w:val="center"/>
           </w:tcPr>
           <w:p>
             <w:pPr>
-              <w:pStyle w:val="a7"/>
-              <w:wordWrap/>
-              <w:spacing w:line="240" w:lineRule="auto"/>
-              <w:jc w:val="center"/>
-              <w:rPr>
-                <w:rFonts w:ascii="Malgun Gothic" w:eastAsia="Malgun Gothic" w:hAnsi="Malgun Gothic" w:cs="Malgun Gothic"/>
-              </w:rPr>
-            </w:pPr>
-            <w:r>
-              <w:rPr>
-                <w:rFonts w:ascii="Malgun Gothic" w:eastAsia="Malgun Gothic" w:hAnsi="Malgun Gothic" w:cs="Malgun Gothic" w:hint="eastAsia"/>
-              </w:rPr>
-              <w:t>영업제공자</w:t>
-            </w:r>
-          </w:p>
-        </w:tc>
-        <w:tc>
-          <w:tcPr>
-            <w:tcW w:w="2921" w:type="dxa"/>
+              <w:pStyle w:val="ac"/>
+              <w:spacing w:line="240" w:lineRule="auto"/>
+              <w:ind w:left="100" w:right="100"/>
+              <w:rPr>
+                <w:rFonts w:ascii="맑은 고딕" w:eastAsia="맑은 고딕" w:hAnsi="맑은 고딕" w:cs="맑은 고딕"/>
+              </w:rPr>
+            </w:pPr>
+            <w:r>
+              <w:rPr>
+                <w:rFonts w:ascii="맑은 고딕" w:eastAsia="맑은 고딕" w:hAnsi="맑은 고딕" w:cs="바탕" w:hint="eastAsia"/>
+              </w:rPr>
+              <w:t>■</w:t>
+            </w:r>
+            <w:r>
+              <w:rPr>
+                <w:rFonts w:ascii="맑은 고딕" w:eastAsia="맑은 고딕" w:hAnsi="맑은 고딕" w:cs="맑은 고딕"/>
+              </w:rPr>
+              <w:t xml:space="preserve"> </w:t>
+            </w:r>
+            <w:r>
+              <w:rPr>
+                <w:rFonts w:ascii="맑은 고딕" w:eastAsia="맑은 고딕" w:hAnsi="맑은 고딕" w:cs="맑은 고딕" w:hint="eastAsia"/>
+              </w:rPr>
+              <w:t>고객사</w:t>
+            </w:r>
+            <w:r>
+              <w:rPr>
+                <w:rFonts w:ascii="맑은 고딕" w:eastAsia="맑은 고딕" w:hAnsi="맑은 고딕" w:cs="맑은 고딕"/>
+              </w:rPr>
+              <w:t xml:space="preserve"> </w:t>
+            </w:r>
+            <w:r>
+              <w:rPr>
+                <w:rFonts w:ascii="맑은 고딕" w:eastAsia="맑은 고딕" w:hAnsi="맑은 고딕" w:cs="맑은 고딕" w:hint="eastAsia"/>
+              </w:rPr>
+              <w:t>개요</w:t>
+            </w:r>
+            <w:r>
+              <w:rPr>
+                <w:rFonts w:ascii="맑은 고딕" w:eastAsia="맑은 고딕" w:hAnsi="맑은 고딕" w:cs="맑은 고딕"/>
+              </w:rPr>
+              <w:t>(</w:t>
+            </w:r>
+            <w:r>
+              <w:rPr>
+                <w:rFonts w:ascii="맑은 고딕" w:eastAsia="맑은 고딕" w:hAnsi="맑은 고딕" w:cs="맑은 고딕" w:hint="eastAsia"/>
+              </w:rPr>
+              <w:t>신규</w:t>
+            </w:r>
+            <w:r>
+              <w:rPr>
+                <w:rFonts w:ascii="맑은 고딕" w:eastAsia="맑은 고딕" w:hAnsi="맑은 고딕" w:cs="맑은 고딕"/>
+              </w:rPr>
+              <w:t xml:space="preserve"> </w:t>
+            </w:r>
+            <w:r>
+              <w:rPr>
+                <w:rFonts w:ascii="맑은 고딕" w:eastAsia="맑은 고딕" w:hAnsi="맑은 고딕" w:cs="맑은 고딕" w:hint="eastAsia"/>
+              </w:rPr>
+              <w:t>고객사일</w:t>
+            </w:r>
+            <w:r>
+              <w:rPr>
+                <w:rFonts w:ascii="맑은 고딕" w:eastAsia="맑은 고딕" w:hAnsi="맑은 고딕" w:cs="맑은 고딕"/>
+              </w:rPr>
+              <w:t xml:space="preserve"> </w:t>
+            </w:r>
+            <w:r>
+              <w:rPr>
+                <w:rFonts w:ascii="맑은 고딕" w:eastAsia="맑은 고딕" w:hAnsi="맑은 고딕" w:cs="맑은 고딕" w:hint="eastAsia"/>
+              </w:rPr>
+              <w:t>경우에만</w:t>
+            </w:r>
+            <w:r>
+              <w:rPr>
+                <w:rFonts w:ascii="맑은 고딕" w:eastAsia="맑은 고딕" w:hAnsi="맑은 고딕" w:cs="맑은 고딕"/>
+              </w:rPr>
+              <w:t xml:space="preserve"> </w:t>
+            </w:r>
+            <w:r>
+              <w:rPr>
+                <w:rFonts w:ascii="맑은 고딕" w:eastAsia="맑은 고딕" w:hAnsi="맑은 고딕" w:cs="맑은 고딕" w:hint="eastAsia"/>
+              </w:rPr>
+              <w:t>기재</w:t>
+            </w:r>
+            <w:r>
+              <w:rPr>
+                <w:rFonts w:ascii="맑은 고딕" w:eastAsia="맑은 고딕" w:hAnsi="맑은 고딕" w:cs="맑은 고딕"/>
+              </w:rPr>
+              <w:t>)</w:t>
+            </w:r>
+          </w:p>
+        </w:tc>
+      </w:tr>
+      <w:tr>
+        <w:trPr>
+          <w:trHeight w:hRule="exact" w:val="1368"/>
+          <w:jc w:val="center"/>
+        </w:trPr>
+        <w:tc>
+          <w:tcPr>
+            <w:tcW w:w="8985" w:type="dxa"/>
+            <w:gridSpan w:val="4"/>
             <w:tcBorders>
               <w:top w:val="dotted" w:sz="6" w:space="0" w:color="A0A0A0"/>
-              <w:left w:val="dotted" w:sz="6" w:space="0" w:color="A0A0A0"/>
-              <w:bottom w:val="dotted" w:sz="6" w:space="0" w:color="A0A0A0"/>
-              <w:right w:val="dotted" w:sz="6" w:space="0" w:color="A0A0A0"/>
-            </w:tcBorders>
-            <w:vAlign w:val="center"/>
-          </w:tcPr>
-          <w:p>
-            <w:pPr>
-              <w:pStyle w:val="a7"/>
-              <w:spacing w:line="240" w:lineRule="auto"/>
-              <w:ind w:left="100" w:right="100"/>
-              <w:rPr>
-                <w:rFonts w:ascii="Malgun Gothic" w:eastAsia="Malgun Gothic" w:hAnsi="Malgun Gothic"/>
-              </w:rPr>
-            </w:pPr>
-          </w:p>
-        </w:tc>
-        <w:tc>
-          <w:tcPr>
-            <w:tcW w:w="1558" w:type="dxa"/>
-            <w:tcBorders>
-              <w:top w:val="dotted" w:sz="6" w:space="0" w:color="A0A0A0"/>
-              <w:left w:val="dotted" w:sz="6" w:space="0" w:color="A0A0A0"/>
-              <w:bottom w:val="dotted" w:sz="6" w:space="0" w:color="A0A0A0"/>
-              <w:right w:val="dotted" w:sz="6" w:space="0" w:color="A0A0A0"/>
-            </w:tcBorders>
-            <w:shd w:val="solid" w:color="EDF0FA" w:fill="auto"/>
-            <w:vAlign w:val="center"/>
-          </w:tcPr>
-          <w:p>
-            <w:pPr>
-              <w:pStyle w:val="a7"/>
-              <w:spacing w:line="240" w:lineRule="auto"/>
-              <w:jc w:val="center"/>
-              <w:rPr>
-                <w:rFonts w:ascii="Malgun Gothic" w:eastAsia="Malgun Gothic" w:hAnsi="Malgun Gothic" w:cs="Malgun Gothic"/>
-              </w:rPr>
-            </w:pPr>
-            <w:r>
-              <w:rPr>
-                <w:rFonts w:ascii="Malgun Gothic" w:eastAsia="Malgun Gothic" w:hAnsi="Malgun Gothic" w:cs="Malgun Gothic" w:hint="eastAsia"/>
-              </w:rPr>
-              <w:t>연</w:t>
-            </w:r>
-            <w:r>
-              <w:rPr>
-                <w:rFonts w:ascii="Malgun Gothic" w:eastAsia="Malgun Gothic" w:hAnsi="Malgun Gothic" w:cs="Malgun Gothic"/>
-              </w:rPr>
-              <w:t xml:space="preserve"> </w:t>
-            </w:r>
-            <w:r>
-              <w:rPr>
-                <w:rFonts w:ascii="Malgun Gothic" w:eastAsia="Malgun Gothic" w:hAnsi="Malgun Gothic" w:cs="Malgun Gothic" w:hint="eastAsia"/>
-              </w:rPr>
-              <w:t>락</w:t>
-            </w:r>
-            <w:r>
-              <w:rPr>
-                <w:rFonts w:ascii="Malgun Gothic" w:eastAsia="Malgun Gothic" w:hAnsi="Malgun Gothic" w:cs="Malgun Gothic"/>
-              </w:rPr>
-              <w:t xml:space="preserve"> </w:t>
-            </w:r>
-            <w:r>
-              <w:rPr>
-                <w:rFonts w:ascii="Malgun Gothic" w:eastAsia="Malgun Gothic" w:hAnsi="Malgun Gothic" w:cs="Malgun Gothic" w:hint="eastAsia"/>
-              </w:rPr>
-              <w:t>처</w:t>
-            </w:r>
-          </w:p>
-        </w:tc>
-        <w:tc>
-          <w:tcPr>
-            <w:tcW w:w="2977" w:type="dxa"/>
-            <w:tcBorders>
-              <w:top w:val="dotted" w:sz="6" w:space="0" w:color="A0A0A0"/>
-              <w:left w:val="dotted" w:sz="6" w:space="0" w:color="A0A0A0"/>
+              <w:left w:val="nil"/>
               <w:bottom w:val="dotted" w:sz="6" w:space="0" w:color="A0A0A0"/>
               <w:right w:val="nil"/>
             </w:tcBorders>
@@ -1152,150 +1351,154 @@
           </w:tcPr>
           <w:p>
             <w:pPr>
-              <w:pStyle w:val="a7"/>
+              <w:pStyle w:val="ac"/>
               <w:spacing w:line="240" w:lineRule="auto"/>
               <w:ind w:left="100" w:right="100"/>
               <w:rPr>
-                <w:rFonts w:ascii="Malgun Gothic" w:eastAsia="Malgun Gothic" w:hAnsi="Malgun Gothic"/>
+                <w:rFonts w:ascii="맑은 고딕" w:eastAsia="맑은 고딕" w:hAnsi="맑은 고딕"/>
               </w:rPr>
             </w:pPr>
           </w:p>
         </w:tc>
       </w:tr>
       <w:tr>
-        <w:tblPrEx>
-          <w:tblCellMar>
-            <w:top w:w="0" w:type="dxa"/>
-            <w:bottom w:w="0" w:type="dxa"/>
-          </w:tblCellMar>
-        </w:tblPrEx>
         <w:trPr>
           <w:trHeight w:hRule="exact" w:val="406"/>
           <w:jc w:val="center"/>
         </w:trPr>
         <w:tc>
           <w:tcPr>
-            <w:tcW w:w="1529" w:type="dxa"/>
+            <w:tcW w:w="8985" w:type="dxa"/>
+            <w:gridSpan w:val="4"/>
             <w:tcBorders>
               <w:top w:val="dotted" w:sz="6" w:space="0" w:color="A0A0A0"/>
               <w:left w:val="single" w:sz="6" w:space="0" w:color="EDF0FA"/>
               <w:bottom w:val="dotted" w:sz="6" w:space="0" w:color="A0A0A0"/>
-              <w:right w:val="dotted" w:sz="6" w:space="0" w:color="A0A0A0"/>
+              <w:right w:val="single" w:sz="6" w:space="0" w:color="EDF0FA"/>
             </w:tcBorders>
             <w:shd w:val="solid" w:color="EDF0FA" w:fill="auto"/>
             <w:vAlign w:val="center"/>
           </w:tcPr>
           <w:p>
             <w:pPr>
-              <w:pStyle w:val="a7"/>
-              <w:wordWrap/>
-              <w:spacing w:line="240" w:lineRule="auto"/>
-              <w:jc w:val="center"/>
-              <w:rPr>
-                <w:rFonts w:ascii="Malgun Gothic" w:eastAsia="Malgun Gothic" w:hAnsi="Malgun Gothic" w:cs="Malgun Gothic"/>
-              </w:rPr>
-            </w:pPr>
-            <w:r>
-              <w:rPr>
-                <w:rFonts w:ascii="Malgun Gothic" w:eastAsia="Malgun Gothic" w:hAnsi="Malgun Gothic" w:cs="Malgun Gothic" w:hint="eastAsia"/>
-              </w:rPr>
-              <w:t>방</w:t>
-            </w:r>
-            <w:r>
-              <w:rPr>
-                <w:rFonts w:ascii="Malgun Gothic" w:eastAsia="Malgun Gothic" w:hAnsi="Malgun Gothic" w:cs="Malgun Gothic"/>
+              <w:pStyle w:val="ac"/>
+              <w:spacing w:line="240" w:lineRule="auto"/>
+              <w:ind w:left="100" w:right="100"/>
+              <w:rPr>
+                <w:rFonts w:ascii="맑은 고딕" w:eastAsia="맑은 고딕" w:hAnsi="맑은 고딕" w:cs="맑은 고딕"/>
+              </w:rPr>
+            </w:pPr>
+            <w:r>
+              <w:rPr>
+                <w:rFonts w:ascii="맑은 고딕" w:eastAsia="맑은 고딕" w:hAnsi="맑은 고딕" w:cs="바탕" w:hint="eastAsia"/>
+              </w:rPr>
+              <w:t>■</w:t>
+            </w:r>
+            <w:r>
+              <w:rPr>
+                <w:rFonts w:ascii="맑은 고딕" w:eastAsia="맑은 고딕" w:hAnsi="맑은 고딕" w:cs="맑은 고딕"/>
               </w:rPr>
               <w:t xml:space="preserve"> </w:t>
             </w:r>
             <w:r>
               <w:rPr>
-                <w:rFonts w:ascii="Malgun Gothic" w:eastAsia="Malgun Gothic" w:hAnsi="Malgun Gothic" w:cs="Malgun Gothic" w:hint="eastAsia"/>
-              </w:rPr>
-              <w:t>문</w:t>
-            </w:r>
-            <w:r>
-              <w:rPr>
-                <w:rFonts w:ascii="Malgun Gothic" w:eastAsia="Malgun Gothic" w:hAnsi="Malgun Gothic" w:cs="Malgun Gothic"/>
+                <w:rFonts w:ascii="맑은 고딕" w:eastAsia="맑은 고딕" w:hAnsi="맑은 고딕" w:cs="맑은 고딕" w:hint="eastAsia"/>
+              </w:rPr>
+              <w:t>프로젝트</w:t>
+            </w:r>
+            <w:r>
+              <w:rPr>
+                <w:rFonts w:ascii="맑은 고딕" w:eastAsia="맑은 고딕" w:hAnsi="맑은 고딕" w:cs="맑은 고딕"/>
               </w:rPr>
               <w:t xml:space="preserve"> </w:t>
             </w:r>
             <w:r>
               <w:rPr>
-                <w:rFonts w:ascii="Malgun Gothic" w:eastAsia="Malgun Gothic" w:hAnsi="Malgun Gothic" w:cs="Malgun Gothic" w:hint="eastAsia"/>
-              </w:rPr>
-              <w:t>자</w:t>
-            </w:r>
-          </w:p>
-        </w:tc>
-        <w:tc>
-          <w:tcPr>
-            <w:tcW w:w="2921" w:type="dxa"/>
+                <w:rFonts w:ascii="맑은 고딕" w:eastAsia="맑은 고딕" w:hAnsi="맑은 고딕" w:cs="맑은 고딕" w:hint="eastAsia"/>
+              </w:rPr>
+              <w:t>개요</w:t>
+            </w:r>
+            <w:r>
+              <w:rPr>
+                <w:rFonts w:ascii="맑은 고딕" w:eastAsia="맑은 고딕" w:hAnsi="맑은 고딕" w:cs="맑은 고딕"/>
+              </w:rPr>
+              <w:t>(</w:t>
+            </w:r>
+            <w:r>
+              <w:rPr>
+                <w:rFonts w:ascii="맑은 고딕" w:eastAsia="맑은 고딕" w:hAnsi="맑은 고딕" w:cs="맑은 고딕" w:hint="eastAsia"/>
+              </w:rPr>
+              <w:t>일상적인</w:t>
+            </w:r>
+            <w:r>
+              <w:rPr>
+                <w:rFonts w:ascii="맑은 고딕" w:eastAsia="맑은 고딕" w:hAnsi="맑은 고딕" w:cs="맑은 고딕"/>
+              </w:rPr>
+              <w:t xml:space="preserve"> </w:t>
+            </w:r>
+            <w:r>
+              <w:rPr>
+                <w:rFonts w:ascii="맑은 고딕" w:eastAsia="맑은 고딕" w:hAnsi="맑은 고딕" w:cs="맑은 고딕" w:hint="eastAsia"/>
+              </w:rPr>
+              <w:t>영업</w:t>
+            </w:r>
+            <w:r>
+              <w:rPr>
+                <w:rFonts w:ascii="맑은 고딕" w:eastAsia="맑은 고딕" w:hAnsi="맑은 고딕" w:cs="맑은 고딕"/>
+              </w:rPr>
+              <w:t xml:space="preserve"> </w:t>
+            </w:r>
+            <w:r>
+              <w:rPr>
+                <w:rFonts w:ascii="맑은 고딕" w:eastAsia="맑은 고딕" w:hAnsi="맑은 고딕" w:cs="맑은 고딕" w:hint="eastAsia"/>
+              </w:rPr>
+              <w:t>방문일</w:t>
+            </w:r>
+            <w:r>
+              <w:rPr>
+                <w:rFonts w:ascii="맑은 고딕" w:eastAsia="맑은 고딕" w:hAnsi="맑은 고딕" w:cs="맑은 고딕"/>
+              </w:rPr>
+              <w:t xml:space="preserve"> </w:t>
+            </w:r>
+            <w:r>
+              <w:rPr>
+                <w:rFonts w:ascii="맑은 고딕" w:eastAsia="맑은 고딕" w:hAnsi="맑은 고딕" w:cs="맑은 고딕" w:hint="eastAsia"/>
+              </w:rPr>
+              <w:t>경우</w:t>
+            </w:r>
+            <w:r>
+              <w:rPr>
+                <w:rFonts w:ascii="맑은 고딕" w:eastAsia="맑은 고딕" w:hAnsi="맑은 고딕" w:cs="맑은 고딕"/>
+              </w:rPr>
+              <w:t xml:space="preserve"> </w:t>
+            </w:r>
+            <w:r>
+              <w:rPr>
+                <w:rFonts w:ascii="맑은 고딕" w:eastAsia="맑은 고딕" w:hAnsi="맑은 고딕" w:cs="맑은 고딕" w:hint="eastAsia"/>
+              </w:rPr>
+              <w:t>생략가능</w:t>
+            </w:r>
+            <w:r>
+              <w:rPr>
+                <w:rFonts w:ascii="맑은 고딕" w:eastAsia="맑은 고딕" w:hAnsi="맑은 고딕" w:cs="맑은 고딕"/>
+              </w:rPr>
+              <w:t>)</w:t>
+            </w:r>
+          </w:p>
+        </w:tc>
+      </w:tr>
+      <w:tr>
+        <w:trPr>
+          <w:trHeight w:hRule="exact" w:val="1368"/>
+          <w:jc w:val="center"/>
+        </w:trPr>
+        <w:tc>
+          <w:tcPr>
+            <w:tcW w:w="8985" w:type="dxa"/>
+            <w:gridSpan w:val="4"/>
             <w:tcBorders>
               <w:top w:val="dotted" w:sz="6" w:space="0" w:color="A0A0A0"/>
-              <w:left w:val="dotted" w:sz="6" w:space="0" w:color="A0A0A0"/>
-              <w:bottom w:val="dotted" w:sz="6" w:space="0" w:color="A0A0A0"/>
-              <w:right w:val="dotted" w:sz="6" w:space="0" w:color="A0A0A0"/>
-            </w:tcBorders>
-            <w:vAlign w:val="center"/>
-          </w:tcPr>
-          <w:p>
-            <w:pPr>
-              <w:pStyle w:val="a7"/>
-              <w:spacing w:line="240" w:lineRule="auto"/>
-              <w:ind w:left="100" w:right="100"/>
-              <w:rPr>
-                <w:rFonts w:ascii="Malgun Gothic" w:eastAsia="Malgun Gothic" w:hAnsi="Malgun Gothic"/>
-              </w:rPr>
-            </w:pPr>
-          </w:p>
-        </w:tc>
-        <w:tc>
-          <w:tcPr>
-            <w:tcW w:w="1558" w:type="dxa"/>
-            <w:tcBorders>
-              <w:top w:val="dotted" w:sz="6" w:space="0" w:color="A0A0A0"/>
-              <w:left w:val="dotted" w:sz="6" w:space="0" w:color="A0A0A0"/>
-              <w:bottom w:val="dotted" w:sz="6" w:space="0" w:color="A0A0A0"/>
-              <w:right w:val="dotted" w:sz="6" w:space="0" w:color="A0A0A0"/>
-            </w:tcBorders>
-            <w:shd w:val="solid" w:color="EDF0FA" w:fill="auto"/>
-            <w:vAlign w:val="center"/>
-          </w:tcPr>
-          <w:p>
-            <w:pPr>
-              <w:pStyle w:val="a7"/>
-              <w:spacing w:line="240" w:lineRule="auto"/>
-              <w:jc w:val="center"/>
-              <w:rPr>
-                <w:rFonts w:ascii="Malgun Gothic" w:eastAsia="Malgun Gothic" w:hAnsi="Malgun Gothic" w:cs="Malgun Gothic"/>
-              </w:rPr>
-            </w:pPr>
-            <w:r>
-              <w:rPr>
-                <w:rFonts w:ascii="Malgun Gothic" w:eastAsia="Malgun Gothic" w:hAnsi="Malgun Gothic" w:cs="Malgun Gothic" w:hint="eastAsia"/>
-              </w:rPr>
-              <w:t>소</w:t>
-            </w:r>
-            <w:r>
-              <w:rPr>
-                <w:rFonts w:ascii="Malgun Gothic" w:eastAsia="Malgun Gothic" w:hAnsi="Malgun Gothic" w:cs="Malgun Gothic"/>
-              </w:rPr>
-              <w:t xml:space="preserve">    </w:t>
-            </w:r>
-            <w:r>
-              <w:rPr>
-                <w:rFonts w:ascii="Malgun Gothic" w:eastAsia="Malgun Gothic" w:hAnsi="Malgun Gothic" w:cs="Malgun Gothic" w:hint="eastAsia"/>
-              </w:rPr>
-              <w:t>속</w:t>
-            </w:r>
-          </w:p>
-        </w:tc>
-        <w:tc>
-          <w:tcPr>
-            <w:tcW w:w="2977" w:type="dxa"/>
-            <w:tcBorders>
-              <w:top w:val="dotted" w:sz="6" w:space="0" w:color="A0A0A0"/>
-              <w:left w:val="dotted" w:sz="6" w:space="0" w:color="A0A0A0"/>
+              <w:left w:val="nil"/>
               <w:bottom w:val="dotted" w:sz="6" w:space="0" w:color="A0A0A0"/>
               <w:right w:val="nil"/>
             </w:tcBorders>
@@ -1303,23 +1506,17 @@
           </w:tcPr>
           <w:p>
             <w:pPr>
-              <w:pStyle w:val="a7"/>
+              <w:pStyle w:val="ac"/>
               <w:spacing w:line="240" w:lineRule="auto"/>
               <w:ind w:left="100" w:right="100"/>
               <w:rPr>
-                <w:rFonts w:ascii="Malgun Gothic" w:eastAsia="Malgun Gothic" w:hAnsi="Malgun Gothic"/>
+                <w:rFonts w:ascii="맑은 고딕" w:eastAsia="맑은 고딕" w:hAnsi="맑은 고딕"/>
               </w:rPr>
             </w:pPr>
           </w:p>
         </w:tc>
       </w:tr>
       <w:tr>
-        <w:tblPrEx>
-          <w:tblCellMar>
-            <w:top w:w="0" w:type="dxa"/>
-            <w:bottom w:w="0" w:type="dxa"/>
-          </w:tblCellMar>
-        </w:tblPrEx>
         <w:trPr>
           <w:trHeight w:hRule="exact" w:val="406"/>
           <w:jc w:val="center"/>
@@ -1339,107 +1536,261 @@
           </w:tcPr>
           <w:p>
             <w:pPr>
-              <w:pStyle w:val="a7"/>
+              <w:pStyle w:val="ac"/>
               <w:spacing w:line="240" w:lineRule="auto"/>
               <w:ind w:left="100" w:right="100"/>
               <w:rPr>
-                <w:rFonts w:ascii="Malgun Gothic" w:eastAsia="Malgun Gothic" w:hAnsi="Malgun Gothic" w:cs="Malgun Gothic"/>
-              </w:rPr>
-            </w:pPr>
-            <w:r>
-              <w:rPr>
-                <w:rFonts w:ascii="Malgun Gothic" w:eastAsia="Malgun Gothic" w:hAnsi="Malgun Gothic" w:cs="Batang" w:hint="eastAsia"/>
+                <w:rFonts w:ascii="맑은 고딕" w:eastAsia="맑은 고딕" w:hAnsi="맑은 고딕" w:cs="맑은 고딕"/>
+              </w:rPr>
+            </w:pPr>
+            <w:r>
+              <w:rPr>
+                <w:rFonts w:ascii="맑은 고딕" w:eastAsia="맑은 고딕" w:hAnsi="맑은 고딕" w:cs="바탕" w:hint="eastAsia"/>
               </w:rPr>
               <w:t>■</w:t>
             </w:r>
             <w:r>
               <w:rPr>
-                <w:rFonts w:ascii="Malgun Gothic" w:eastAsia="Malgun Gothic" w:hAnsi="Malgun Gothic" w:cs="Malgun Gothic"/>
+                <w:rFonts w:ascii="맑은 고딕" w:eastAsia="맑은 고딕" w:hAnsi="맑은 고딕" w:cs="맑은 고딕"/>
               </w:rPr>
               <w:t xml:space="preserve"> </w:t>
             </w:r>
             <w:r>
               <w:rPr>
-                <w:rFonts w:ascii="Malgun Gothic" w:eastAsia="Malgun Gothic" w:hAnsi="Malgun Gothic" w:cs="Malgun Gothic" w:hint="eastAsia"/>
-              </w:rPr>
-              <w:t>고객사</w:t>
-            </w:r>
-            <w:r>
-              <w:rPr>
-                <w:rFonts w:ascii="Malgun Gothic" w:eastAsia="Malgun Gothic" w:hAnsi="Malgun Gothic" w:cs="Malgun Gothic"/>
+                <w:rFonts w:ascii="맑은 고딕" w:eastAsia="맑은 고딕" w:hAnsi="맑은 고딕" w:cs="맑은 고딕" w:hint="eastAsia"/>
+              </w:rPr>
+              <w:t>방문</w:t>
+            </w:r>
+            <w:r>
+              <w:rPr>
+                <w:rFonts w:ascii="맑은 고딕" w:eastAsia="맑은 고딕" w:hAnsi="맑은 고딕" w:cs="맑은 고딕"/>
               </w:rPr>
               <w:t xml:space="preserve"> </w:t>
             </w:r>
             <w:r>
               <w:rPr>
-                <w:rFonts w:ascii="Malgun Gothic" w:eastAsia="Malgun Gothic" w:hAnsi="Malgun Gothic" w:cs="Malgun Gothic" w:hint="eastAsia"/>
-              </w:rPr>
-              <w:t>개요</w:t>
-            </w:r>
-            <w:r>
-              <w:rPr>
-                <w:rFonts w:ascii="Malgun Gothic" w:eastAsia="Malgun Gothic" w:hAnsi="Malgun Gothic" w:cs="Malgun Gothic"/>
-              </w:rPr>
-              <w:t>(</w:t>
-            </w:r>
-            <w:r>
-              <w:rPr>
-                <w:rFonts w:ascii="Malgun Gothic" w:eastAsia="Malgun Gothic" w:hAnsi="Malgun Gothic" w:cs="Malgun Gothic" w:hint="eastAsia"/>
-              </w:rPr>
-              <w:t>신규</w:t>
-            </w:r>
-            <w:r>
-              <w:rPr>
-                <w:rFonts w:ascii="Malgun Gothic" w:eastAsia="Malgun Gothic" w:hAnsi="Malgun Gothic" w:cs="Malgun Gothic"/>
+                <w:rFonts w:ascii="맑은 고딕" w:eastAsia="맑은 고딕" w:hAnsi="맑은 고딕" w:cs="맑은 고딕" w:hint="eastAsia"/>
+              </w:rPr>
+              <w:t>및</w:t>
+            </w:r>
+            <w:r>
+              <w:rPr>
+                <w:rFonts w:ascii="맑은 고딕" w:eastAsia="맑은 고딕" w:hAnsi="맑은 고딕" w:cs="맑은 고딕"/>
               </w:rPr>
               <w:t xml:space="preserve"> </w:t>
             </w:r>
             <w:r>
               <w:rPr>
-                <w:rFonts w:ascii="Malgun Gothic" w:eastAsia="Malgun Gothic" w:hAnsi="Malgun Gothic" w:cs="Malgun Gothic" w:hint="eastAsia"/>
-              </w:rPr>
-              <w:t>고객사일</w:t>
-            </w:r>
-            <w:r>
-              <w:rPr>
-                <w:rFonts w:ascii="Malgun Gothic" w:eastAsia="Malgun Gothic" w:hAnsi="Malgun Gothic" w:cs="Malgun Gothic"/>
-              </w:rPr>
-              <w:t xml:space="preserve"> </w:t>
-            </w:r>
-            <w:r>
-              <w:rPr>
-                <w:rFonts w:ascii="Malgun Gothic" w:eastAsia="Malgun Gothic" w:hAnsi="Malgun Gothic" w:cs="Malgun Gothic" w:hint="eastAsia"/>
-              </w:rPr>
-              <w:t>경우에만</w:t>
-            </w:r>
-            <w:r>
-              <w:rPr>
-                <w:rFonts w:ascii="Malgun Gothic" w:eastAsia="Malgun Gothic" w:hAnsi="Malgun Gothic" w:cs="Malgun Gothic"/>
-              </w:rPr>
-              <w:t xml:space="preserve"> </w:t>
-            </w:r>
-            <w:r>
-              <w:rPr>
-                <w:rFonts w:ascii="Malgun Gothic" w:eastAsia="Malgun Gothic" w:hAnsi="Malgun Gothic" w:cs="Malgun Gothic" w:hint="eastAsia"/>
-              </w:rPr>
-              <w:t>기재</w:t>
-            </w:r>
-            <w:r>
-              <w:rPr>
-                <w:rFonts w:ascii="Malgun Gothic" w:eastAsia="Malgun Gothic" w:hAnsi="Malgun Gothic" w:cs="Malgun Gothic"/>
-              </w:rPr>
-              <w:t>)</w:t>
+                <w:rFonts w:ascii="맑은 고딕" w:eastAsia="맑은 고딕" w:hAnsi="맑은 고딕" w:cs="맑은 고딕" w:hint="eastAsia"/>
+              </w:rPr>
+              <w:t>협의내용</w:t>
             </w:r>
           </w:p>
         </w:tc>
       </w:tr>
       <w:tr>
-        <w:tblPrEx>
-          <w:tblCellMar>
-            <w:top w:w="0" w:type="dxa"/>
-            <w:bottom w:w="0" w:type="dxa"/>
-          </w:tblCellMar>
-        </w:tblPrEx>
+        <w:trPr>
+          <w:trHeight w:hRule="exact" w:val="1991"/>
+          <w:jc w:val="center"/>
+        </w:trPr>
+        <w:tc>
+          <w:tcPr>
+            <w:tcW w:w="8985" w:type="dxa"/>
+            <w:gridSpan w:val="4"/>
+            <w:tcBorders>
+              <w:top w:val="dotted" w:sz="6" w:space="0" w:color="A0A0A0"/>
+              <w:left w:val="nil"/>
+              <w:bottom w:val="dotted" w:sz="6" w:space="0" w:color="A0A0A0"/>
+              <w:right w:val="nil"/>
+            </w:tcBorders>
+            <w:vAlign w:val="center"/>
+          </w:tcPr>
+          <w:p>
+            <w:pPr>
+              <w:pStyle w:val="ac"/>
+              <w:spacing w:line="240" w:lineRule="auto"/>
+              <w:ind w:left="100" w:right="100"/>
+              <w:rPr>
+                <w:rFonts w:ascii="맑은 고딕" w:eastAsia="맑은 고딕" w:hAnsi="맑은 고딕"/>
+              </w:rPr>
+            </w:pPr>
+          </w:p>
+        </w:tc>
+      </w:tr>
+      <w:tr>
+        <w:trPr>
+          <w:trHeight w:hRule="exact" w:val="406"/>
+          <w:jc w:val="center"/>
+        </w:trPr>
+        <w:tc>
+          <w:tcPr>
+            <w:tcW w:w="8985" w:type="dxa"/>
+            <w:gridSpan w:val="4"/>
+            <w:tcBorders>
+              <w:top w:val="dotted" w:sz="6" w:space="0" w:color="A0A0A0"/>
+              <w:left w:val="single" w:sz="6" w:space="0" w:color="EDF0FA"/>
+              <w:bottom w:val="dotted" w:sz="6" w:space="0" w:color="A0A0A0"/>
+              <w:right w:val="single" w:sz="6" w:space="0" w:color="EDF0FA"/>
+            </w:tcBorders>
+            <w:shd w:val="solid" w:color="EDF0FA" w:fill="auto"/>
+            <w:vAlign w:val="center"/>
+          </w:tcPr>
+          <w:p>
+            <w:pPr>
+              <w:pStyle w:val="ac"/>
+              <w:spacing w:line="240" w:lineRule="auto"/>
+              <w:ind w:left="100" w:right="100"/>
+              <w:rPr>
+                <w:rFonts w:ascii="맑은 고딕" w:eastAsia="맑은 고딕" w:hAnsi="맑은 고딕" w:cs="맑은 고딕"/>
+              </w:rPr>
+            </w:pPr>
+            <w:r>
+              <w:rPr>
+                <w:rFonts w:ascii="맑은 고딕" w:eastAsia="맑은 고딕" w:hAnsi="맑은 고딕" w:cs="바탕" w:hint="eastAsia"/>
+              </w:rPr>
+              <w:t>■</w:t>
+            </w:r>
+            <w:r>
+              <w:rPr>
+                <w:rFonts w:ascii="맑은 고딕" w:eastAsia="맑은 고딕" w:hAnsi="맑은 고딕" w:cs="맑은 고딕"/>
+              </w:rPr>
+              <w:t xml:space="preserve"> </w:t>
+            </w:r>
+            <w:r>
+              <w:rPr>
+                <w:rFonts w:ascii="맑은 고딕" w:eastAsia="맑은 고딕" w:hAnsi="맑은 고딕" w:cs="맑은 고딕" w:hint="eastAsia"/>
+              </w:rPr>
+              <w:t>향후계획</w:t>
+            </w:r>
+            <w:r>
+              <w:rPr>
+                <w:rFonts w:ascii="맑은 고딕" w:eastAsia="맑은 고딕" w:hAnsi="맑은 고딕" w:cs="맑은 고딕"/>
+              </w:rPr>
+              <w:t xml:space="preserve"> </w:t>
+            </w:r>
+            <w:r>
+              <w:rPr>
+                <w:rFonts w:ascii="맑은 고딕" w:eastAsia="맑은 고딕" w:hAnsi="맑은 고딕" w:cs="맑은 고딕" w:hint="eastAsia"/>
+              </w:rPr>
+              <w:t>및</w:t>
+            </w:r>
+            <w:r>
+              <w:rPr>
+                <w:rFonts w:ascii="맑은 고딕" w:eastAsia="맑은 고딕" w:hAnsi="맑은 고딕" w:cs="맑은 고딕"/>
+              </w:rPr>
+              <w:t xml:space="preserve"> </w:t>
+            </w:r>
+            <w:r>
+              <w:rPr>
+                <w:rFonts w:ascii="맑은 고딕" w:eastAsia="맑은 고딕" w:hAnsi="맑은 고딕" w:cs="맑은 고딕" w:hint="eastAsia"/>
+              </w:rPr>
+              <w:t>일정</w:t>
+            </w:r>
+          </w:p>
+        </w:tc>
+      </w:tr>
+      <w:tr>
+        <w:trPr>
+          <w:trHeight w:hRule="exact" w:val="1991"/>
+          <w:jc w:val="center"/>
+        </w:trPr>
+        <w:tc>
+          <w:tcPr>
+            <w:tcW w:w="8985" w:type="dxa"/>
+            <w:gridSpan w:val="4"/>
+            <w:tcBorders>
+              <w:top w:val="dotted" w:sz="6" w:space="0" w:color="A0A0A0"/>
+              <w:left w:val="nil"/>
+              <w:bottom w:val="dotted" w:sz="6" w:space="0" w:color="A0A0A0"/>
+              <w:right w:val="nil"/>
+            </w:tcBorders>
+            <w:vAlign w:val="center"/>
+          </w:tcPr>
+          <w:p>
+            <w:pPr>
+              <w:pStyle w:val="ac"/>
+              <w:spacing w:line="240" w:lineRule="auto"/>
+              <w:ind w:left="100" w:right="100"/>
+              <w:rPr>
+                <w:rFonts w:ascii="맑은 고딕" w:eastAsia="맑은 고딕" w:hAnsi="맑은 고딕"/>
+              </w:rPr>
+            </w:pPr>
+          </w:p>
+        </w:tc>
+      </w:tr>
+      <w:tr>
+        <w:trPr>
+          <w:trHeight w:hRule="exact" w:val="406"/>
+          <w:jc w:val="center"/>
+        </w:trPr>
+        <w:tc>
+          <w:tcPr>
+            <w:tcW w:w="8985" w:type="dxa"/>
+            <w:gridSpan w:val="4"/>
+            <w:tcBorders>
+              <w:top w:val="dotted" w:sz="6" w:space="0" w:color="A0A0A0"/>
+              <w:left w:val="single" w:sz="6" w:space="0" w:color="EDF0FA"/>
+              <w:bottom w:val="dotted" w:sz="6" w:space="0" w:color="A0A0A0"/>
+              <w:right w:val="single" w:sz="6" w:space="0" w:color="EDF0FA"/>
+            </w:tcBorders>
+            <w:shd w:val="solid" w:color="EDF0FA" w:fill="auto"/>
+            <w:vAlign w:val="center"/>
+          </w:tcPr>
+          <w:p>
+            <w:pPr>
+              <w:pStyle w:val="ac"/>
+              <w:spacing w:line="240" w:lineRule="auto"/>
+              <w:ind w:left="100" w:right="100"/>
+              <w:rPr>
+                <w:rFonts w:ascii="맑은 고딕" w:eastAsia="맑은 고딕" w:hAnsi="맑은 고딕" w:cs="맑은 고딕"/>
+              </w:rPr>
+            </w:pPr>
+            <w:r>
+              <w:rPr>
+                <w:rFonts w:ascii="맑은 고딕" w:eastAsia="맑은 고딕" w:hAnsi="맑은 고딕" w:cs="바탕" w:hint="eastAsia"/>
+              </w:rPr>
+              <w:t>■</w:t>
+            </w:r>
+            <w:r>
+              <w:rPr>
+                <w:rFonts w:ascii="맑은 고딕" w:eastAsia="맑은 고딕" w:hAnsi="맑은 고딕" w:cs="맑은 고딕"/>
+              </w:rPr>
+              <w:t xml:space="preserve"> </w:t>
+            </w:r>
+            <w:r>
+              <w:rPr>
+                <w:rFonts w:ascii="맑은 고딕" w:eastAsia="맑은 고딕" w:hAnsi="맑은 고딕" w:cs="맑은 고딕" w:hint="eastAsia"/>
+              </w:rPr>
+              <w:t>협조사항</w:t>
+            </w:r>
+            <w:r>
+              <w:rPr>
+                <w:rFonts w:ascii="맑은 고딕" w:eastAsia="맑은 고딕" w:hAnsi="맑은 고딕" w:cs="맑은 고딕"/>
+              </w:rPr>
+              <w:t xml:space="preserve"> </w:t>
+            </w:r>
+            <w:r>
+              <w:rPr>
+                <w:rFonts w:ascii="맑은 고딕" w:eastAsia="맑은 고딕" w:hAnsi="맑은 고딕" w:cs="맑은 고딕" w:hint="eastAsia"/>
+              </w:rPr>
+              <w:t>및</w:t>
+            </w:r>
+            <w:r>
+              <w:rPr>
+                <w:rFonts w:ascii="맑은 고딕" w:eastAsia="맑은 고딕" w:hAnsi="맑은 고딕" w:cs="맑은 고딕"/>
+              </w:rPr>
+              <w:t xml:space="preserve"> </w:t>
+            </w:r>
+            <w:r>
+              <w:rPr>
+                <w:rFonts w:ascii="맑은 고딕" w:eastAsia="맑은 고딕" w:hAnsi="맑은 고딕" w:cs="맑은 고딕" w:hint="eastAsia"/>
+              </w:rPr>
+              <w:t>공유사항</w:t>
+            </w:r>
+          </w:p>
+        </w:tc>
+      </w:tr>
+      <w:tr>
         <w:trPr>
           <w:trHeight w:hRule="exact" w:val="1368"/>
           <w:jc w:val="center"/>
@@ -1451,512 +1802,6 @@
             <w:tcBorders>
               <w:top w:val="dotted" w:sz="6" w:space="0" w:color="A0A0A0"/>
               <w:left w:val="nil"/>
-              <w:bottom w:val="dotted" w:sz="6" w:space="0" w:color="A0A0A0"/>
-              <w:right w:val="nil"/>
-            </w:tcBorders>
-            <w:vAlign w:val="center"/>
-          </w:tcPr>
-          <w:p>
-            <w:pPr>
-              <w:pStyle w:val="a7"/>
-              <w:spacing w:line="240" w:lineRule="auto"/>
-              <w:ind w:left="100" w:right="100"/>
-              <w:rPr>
-                <w:rFonts w:ascii="Malgun Gothic" w:eastAsia="Malgun Gothic" w:hAnsi="Malgun Gothic"/>
-              </w:rPr>
-            </w:pPr>
-          </w:p>
-        </w:tc>
-      </w:tr>
-      <w:tr>
-        <w:tblPrEx>
-          <w:tblCellMar>
-            <w:top w:w="0" w:type="dxa"/>
-            <w:bottom w:w="0" w:type="dxa"/>
-          </w:tblCellMar>
-        </w:tblPrEx>
-        <w:trPr>
-          <w:trHeight w:hRule="exact" w:val="406"/>
-          <w:jc w:val="center"/>
-        </w:trPr>
-        <w:tc>
-          <w:tcPr>
-            <w:tcW w:w="8985" w:type="dxa"/>
-            <w:gridSpan w:val="4"/>
-            <w:tcBorders>
-              <w:top w:val="dotted" w:sz="6" w:space="0" w:color="A0A0A0"/>
-              <w:left w:val="single" w:sz="6" w:space="0" w:color="EDF0FA"/>
-              <w:bottom w:val="dotted" w:sz="6" w:space="0" w:color="A0A0A0"/>
-              <w:right w:val="single" w:sz="6" w:space="0" w:color="EDF0FA"/>
-            </w:tcBorders>
-            <w:shd w:val="solid" w:color="EDF0FA" w:fill="auto"/>
-            <w:vAlign w:val="center"/>
-          </w:tcPr>
-          <w:p>
-            <w:pPr>
-              <w:pStyle w:val="a7"/>
-              <w:spacing w:line="240" w:lineRule="auto"/>
-              <w:ind w:left="100" w:right="100"/>
-              <w:rPr>
-                <w:rFonts w:ascii="Malgun Gothic" w:eastAsia="Malgun Gothic" w:hAnsi="Malgun Gothic" w:cs="Malgun Gothic"/>
-              </w:rPr>
-            </w:pPr>
-            <w:r>
-              <w:rPr>
-                <w:rFonts w:ascii="Malgun Gothic" w:eastAsia="Malgun Gothic" w:hAnsi="Malgun Gothic" w:cs="Batang" w:hint="eastAsia"/>
-              </w:rPr>
-              <w:t>■</w:t>
-            </w:r>
-            <w:r>
-              <w:rPr>
-                <w:rFonts w:ascii="Malgun Gothic" w:eastAsia="Malgun Gothic" w:hAnsi="Malgun Gothic" w:cs="Malgun Gothic"/>
-              </w:rPr>
-              <w:t xml:space="preserve"> </w:t>
-            </w:r>
-            <w:r>
-              <w:rPr>
-                <w:rFonts w:ascii="Malgun Gothic" w:eastAsia="Malgun Gothic" w:hAnsi="Malgun Gothic" w:cs="Malgun Gothic" w:hint="eastAsia"/>
-              </w:rPr>
-              <w:t>프로젝트</w:t>
-            </w:r>
-            <w:r>
-              <w:rPr>
-                <w:rFonts w:ascii="Malgun Gothic" w:eastAsia="Malgun Gothic" w:hAnsi="Malgun Gothic" w:cs="Malgun Gothic"/>
-              </w:rPr>
-              <w:t xml:space="preserve"> </w:t>
-            </w:r>
-            <w:r>
-              <w:rPr>
-                <w:rFonts w:ascii="Malgun Gothic" w:eastAsia="Malgun Gothic" w:hAnsi="Malgun Gothic" w:cs="Malgun Gothic" w:hint="eastAsia"/>
-              </w:rPr>
-              <w:t>개요</w:t>
-            </w:r>
-            <w:r>
-              <w:rPr>
-                <w:rFonts w:ascii="Malgun Gothic" w:eastAsia="Malgun Gothic" w:hAnsi="Malgun Gothic" w:cs="Malgun Gothic"/>
-              </w:rPr>
-              <w:t>(</w:t>
-            </w:r>
-            <w:r>
-              <w:rPr>
-                <w:rFonts w:ascii="Malgun Gothic" w:eastAsia="Malgun Gothic" w:hAnsi="Malgun Gothic" w:cs="Malgun Gothic" w:hint="eastAsia"/>
-              </w:rPr>
-              <w:t>일상적인</w:t>
-            </w:r>
-            <w:r>
-              <w:rPr>
-                <w:rFonts w:ascii="Malgun Gothic" w:eastAsia="Malgun Gothic" w:hAnsi="Malgun Gothic" w:cs="Malgun Gothic"/>
-              </w:rPr>
-              <w:t xml:space="preserve"> </w:t>
-            </w:r>
-            <w:r>
-              <w:rPr>
-                <w:rFonts w:ascii="Malgun Gothic" w:eastAsia="Malgun Gothic" w:hAnsi="Malgun Gothic" w:cs="Malgun Gothic" w:hint="eastAsia"/>
-              </w:rPr>
-              <w:t>영업</w:t>
-            </w:r>
-            <w:r>
-              <w:rPr>
-                <w:rFonts w:ascii="Malgun Gothic" w:eastAsia="Malgun Gothic" w:hAnsi="Malgun Gothic" w:cs="Malgun Gothic"/>
-              </w:rPr>
-              <w:t xml:space="preserve"> </w:t>
-            </w:r>
-            <w:r>
-              <w:rPr>
-                <w:rFonts w:ascii="Malgun Gothic" w:eastAsia="Malgun Gothic" w:hAnsi="Malgun Gothic" w:cs="Malgun Gothic" w:hint="eastAsia"/>
-              </w:rPr>
-              <w:t>방문일</w:t>
-            </w:r>
-            <w:r>
-              <w:rPr>
-                <w:rFonts w:ascii="Malgun Gothic" w:eastAsia="Malgun Gothic" w:hAnsi="Malgun Gothic" w:cs="Malgun Gothic"/>
-              </w:rPr>
-              <w:t xml:space="preserve"> </w:t>
-            </w:r>
-            <w:r>
-              <w:rPr>
-                <w:rFonts w:ascii="Malgun Gothic" w:eastAsia="Malgun Gothic" w:hAnsi="Malgun Gothic" w:cs="Malgun Gothic" w:hint="eastAsia"/>
-              </w:rPr>
-              <w:t>경우</w:t>
-            </w:r>
-            <w:r>
-              <w:rPr>
-                <w:rFonts w:ascii="Malgun Gothic" w:eastAsia="Malgun Gothic" w:hAnsi="Malgun Gothic" w:cs="Malgun Gothic"/>
-              </w:rPr>
-              <w:t xml:space="preserve"> </w:t>
-            </w:r>
-            <w:r>
-              <w:rPr>
-                <w:rFonts w:ascii="Malgun Gothic" w:eastAsia="Malgun Gothic" w:hAnsi="Malgun Gothic" w:cs="Malgun Gothic" w:hint="eastAsia"/>
-              </w:rPr>
-              <w:t>생략가능</w:t>
-            </w:r>
-            <w:r>
-              <w:rPr>
-                <w:rFonts w:ascii="Malgun Gothic" w:eastAsia="Malgun Gothic" w:hAnsi="Malgun Gothic" w:cs="Malgun Gothic"/>
-              </w:rPr>
-              <w:t>)</w:t>
-            </w:r>
-          </w:p>
-        </w:tc>
-      </w:tr>
-      <w:tr>
-        <w:tblPrEx>
-          <w:tblCellMar>
-            <w:top w:w="0" w:type="dxa"/>
-            <w:bottom w:w="0" w:type="dxa"/>
-          </w:tblCellMar>
-        </w:tblPrEx>
-        <w:trPr>
-          <w:trHeight w:hRule="exact" w:val="1368"/>
-          <w:jc w:val="center"/>
-        </w:trPr>
-        <w:tc>
-          <w:tcPr>
-            <w:tcW w:w="8985" w:type="dxa"/>
-            <w:gridSpan w:val="4"/>
-            <w:tcBorders>
-              <w:top w:val="dotted" w:sz="6" w:space="0" w:color="A0A0A0"/>
-              <w:left w:val="nil"/>
-              <w:bottom w:val="dotted" w:sz="6" w:space="0" w:color="A0A0A0"/>
-              <w:right w:val="nil"/>
-            </w:tcBorders>
-            <w:vAlign w:val="center"/>
-          </w:tcPr>
-          <w:p>
-            <w:pPr>
-              <w:pStyle w:val="a7"/>
-              <w:spacing w:line="240" w:lineRule="auto"/>
-              <w:ind w:left="100" w:right="100"/>
-              <w:rPr>
-                <w:rFonts w:ascii="Malgun Gothic" w:eastAsia="Malgun Gothic" w:hAnsi="Malgun Gothic"/>
-              </w:rPr>
-            </w:pPr>
-          </w:p>
-        </w:tc>
-      </w:tr>
-      <w:tr>
-        <w:tblPrEx>
-          <w:tblCellMar>
-            <w:top w:w="0" w:type="dxa"/>
-            <w:bottom w:w="0" w:type="dxa"/>
-          </w:tblCellMar>
-        </w:tblPrEx>
-        <w:trPr>
-          <w:trHeight w:hRule="exact" w:val="406"/>
-          <w:jc w:val="center"/>
-        </w:trPr>
-        <w:tc>
-          <w:tcPr>
-            <w:tcW w:w="8985" w:type="dxa"/>
-            <w:gridSpan w:val="4"/>
-            <w:tcBorders>
-              <w:top w:val="dotted" w:sz="6" w:space="0" w:color="A0A0A0"/>
-              <w:left w:val="single" w:sz="6" w:space="0" w:color="EDF0FA"/>
-              <w:bottom w:val="dotted" w:sz="6" w:space="0" w:color="A0A0A0"/>
-              <w:right w:val="single" w:sz="6" w:space="0" w:color="EDF0FA"/>
-            </w:tcBorders>
-            <w:shd w:val="solid" w:color="EDF0FA" w:fill="auto"/>
-            <w:vAlign w:val="center"/>
-          </w:tcPr>
-          <w:p>
-            <w:pPr>
-              <w:pStyle w:val="a7"/>
-              <w:spacing w:line="240" w:lineRule="auto"/>
-              <w:ind w:left="100" w:right="100"/>
-              <w:rPr>
-                <w:rFonts w:ascii="Malgun Gothic" w:eastAsia="Malgun Gothic" w:hAnsi="Malgun Gothic" w:cs="Malgun Gothic"/>
-              </w:rPr>
-            </w:pPr>
-            <w:r>
-              <w:rPr>
-                <w:rFonts w:ascii="Malgun Gothic" w:eastAsia="Malgun Gothic" w:hAnsi="Malgun Gothic" w:cs="Batang" w:hint="eastAsia"/>
-              </w:rPr>
-              <w:t>■</w:t>
-            </w:r>
-            <w:r>
-              <w:rPr>
-                <w:rFonts w:ascii="Malgun Gothic" w:eastAsia="Malgun Gothic" w:hAnsi="Malgun Gothic" w:cs="Malgun Gothic"/>
-              </w:rPr>
-              <w:t xml:space="preserve"> </w:t>
-            </w:r>
-            <w:r>
-              <w:rPr>
-                <w:rFonts w:ascii="Malgun Gothic" w:eastAsia="Malgun Gothic" w:hAnsi="Malgun Gothic" w:cs="Malgun Gothic" w:hint="eastAsia"/>
-              </w:rPr>
-              <w:t>방문</w:t>
-            </w:r>
-            <w:r>
-              <w:rPr>
-                <w:rFonts w:ascii="Malgun Gothic" w:eastAsia="Malgun Gothic" w:hAnsi="Malgun Gothic" w:cs="Malgun Gothic"/>
-              </w:rPr>
-              <w:t xml:space="preserve"> </w:t>
-            </w:r>
-            <w:r>
-              <w:rPr>
-                <w:rFonts w:ascii="Malgun Gothic" w:eastAsia="Malgun Gothic" w:hAnsi="Malgun Gothic" w:cs="Malgun Gothic" w:hint="eastAsia"/>
-              </w:rPr>
-              <w:t>및</w:t>
-            </w:r>
-            <w:r>
-              <w:rPr>
-                <w:rFonts w:ascii="Malgun Gothic" w:eastAsia="Malgun Gothic" w:hAnsi="Malgun Gothic" w:cs="Malgun Gothic"/>
-              </w:rPr>
-              <w:t xml:space="preserve"> </w:t>
-            </w:r>
-            <w:r>
-              <w:rPr>
-                <w:rFonts w:ascii="Malgun Gothic" w:eastAsia="Malgun Gothic" w:hAnsi="Malgun Gothic" w:cs="Malgun Gothic" w:hint="eastAsia"/>
-              </w:rPr>
-              <w:t>협의내용</w:t>
-            </w:r>
-          </w:p>
-        </w:tc>
-      </w:tr>
-      <w:tr>
-        <w:tblPrEx>
-          <w:tblCellMar>
-            <w:top w:w="0" w:type="dxa"/>
-            <w:bottom w:w="0" w:type="dxa"/>
-          </w:tblCellMar>
-        </w:tblPrEx>
-        <w:trPr>
-          <w:trHeight w:hRule="exact" w:val="1991"/>
-          <w:jc w:val="center"/>
-        </w:trPr>
-        <w:tc>
-          <w:tcPr>
-            <w:tcW w:w="8985" w:type="dxa"/>
-            <w:gridSpan w:val="4"/>
-            <w:tcBorders>
-              <w:top w:val="dotted" w:sz="6" w:space="0" w:color="A0A0A0"/>
-              <w:left w:val="nil"/>
-              <w:bottom w:val="dotted" w:sz="6" w:space="0" w:color="A0A0A0"/>
-              <w:right w:val="nil"/>
-            </w:tcBorders>
-            <w:vAlign w:val="center"/>
-          </w:tcPr>
-          <w:p>
-            <w:pPr>
-              <w:pStyle w:val="a7"/>
-              <w:spacing w:line="240" w:lineRule="auto"/>
-              <w:ind w:left="100" w:right="100"/>
-              <w:rPr>
-                <w:rFonts w:ascii="Malgun Gothic" w:eastAsia="Malgun Gothic" w:hAnsi="Malgun Gothic"/>
-              </w:rPr>
-            </w:pPr>
-          </w:p>
-        </w:tc>
-      </w:tr>
-      <w:tr>
-        <w:tblPrEx>
-          <w:tblCellMar>
-            <w:top w:w="0" w:type="dxa"/>
-            <w:bottom w:w="0" w:type="dxa"/>
-          </w:tblCellMar>
-        </w:tblPrEx>
-        <w:trPr>
-          <w:trHeight w:hRule="exact" w:val="406"/>
-          <w:jc w:val="center"/>
-        </w:trPr>
-        <w:tc>
-          <w:tcPr>
-            <w:tcW w:w="8985" w:type="dxa"/>
-            <w:gridSpan w:val="4"/>
-            <w:tcBorders>
-              <w:top w:val="dotted" w:sz="6" w:space="0" w:color="A0A0A0"/>
-              <w:left w:val="single" w:sz="6" w:space="0" w:color="EDF0FA"/>
-              <w:bottom w:val="dotted" w:sz="6" w:space="0" w:color="A0A0A0"/>
-              <w:right w:val="single" w:sz="6" w:space="0" w:color="EDF0FA"/>
-            </w:tcBorders>
-            <w:shd w:val="solid" w:color="EDF0FA" w:fill="auto"/>
-            <w:vAlign w:val="center"/>
-          </w:tcPr>
-          <w:p>
-            <w:pPr>
-              <w:pStyle w:val="a7"/>
-              <w:spacing w:line="240" w:lineRule="auto"/>
-              <w:ind w:left="100" w:right="100"/>
-              <w:rPr>
-                <w:rFonts w:ascii="Malgun Gothic" w:eastAsia="Malgun Gothic" w:hAnsi="Malgun Gothic" w:cs="Malgun Gothic"/>
-              </w:rPr>
-            </w:pPr>
-            <w:r>
-              <w:rPr>
-                <w:rFonts w:ascii="Malgun Gothic" w:eastAsia="Malgun Gothic" w:hAnsi="Malgun Gothic" w:cs="Batang" w:hint="eastAsia"/>
-              </w:rPr>
-              <w:t>■</w:t>
-            </w:r>
-            <w:r>
-              <w:rPr>
-                <w:rFonts w:ascii="Malgun Gothic" w:eastAsia="Malgun Gothic" w:hAnsi="Malgun Gothic" w:cs="Malgun Gothic"/>
-              </w:rPr>
-              <w:t xml:space="preserve"> </w:t>
-            </w:r>
-            <w:r>
-              <w:rPr>
-                <w:rFonts w:ascii="Malgun Gothic" w:eastAsia="Malgun Gothic" w:hAnsi="Malgun Gothic" w:cs="Malgun Gothic" w:hint="eastAsia"/>
-              </w:rPr>
-              <w:t>향후계획</w:t>
-            </w:r>
-            <w:r>
-              <w:rPr>
-                <w:rFonts w:ascii="Malgun Gothic" w:eastAsia="Malgun Gothic" w:hAnsi="Malgun Gothic" w:cs="Malgun Gothic"/>
-              </w:rPr>
-              <w:t xml:space="preserve"> </w:t>
-            </w:r>
-            <w:r>
-              <w:rPr>
-                <w:rFonts w:ascii="Malgun Gothic" w:eastAsia="Malgun Gothic" w:hAnsi="Malgun Gothic" w:cs="Malgun Gothic" w:hint="eastAsia"/>
-              </w:rPr>
-              <w:t>및</w:t>
-            </w:r>
-            <w:r>
-              <w:rPr>
-                <w:rFonts w:ascii="Malgun Gothic" w:eastAsia="Malgun Gothic" w:hAnsi="Malgun Gothic" w:cs="Malgun Gothic"/>
-              </w:rPr>
-              <w:t xml:space="preserve"> </w:t>
-            </w:r>
-            <w:r>
-              <w:rPr>
-                <w:rFonts w:ascii="Malgun Gothic" w:eastAsia="Malgun Gothic" w:hAnsi="Malgun Gothic" w:cs="Malgun Gothic" w:hint="eastAsia"/>
-              </w:rPr>
-              <w:t>일정</w:t>
-            </w:r>
-          </w:p>
-        </w:tc>
-      </w:tr>
-      <w:tr>
-        <w:tblPrEx>
-          <w:tblCellMar>
-            <w:top w:w="0" w:type="dxa"/>
-            <w:bottom w:w="0" w:type="dxa"/>
-          </w:tblCellMar>
-        </w:tblPrEx>
-        <w:trPr>
-          <w:trHeight w:hRule="exact" w:val="1991"/>
-          <w:jc w:val="center"/>
-        </w:trPr>
-        <w:tc>
-          <w:tcPr>
-            <w:tcW w:w="8985" w:type="dxa"/>
-            <w:gridSpan w:val="4"/>
-            <w:tcBorders>
-              <w:top w:val="dotted" w:sz="6" w:space="0" w:color="A0A0A0"/>
-              <w:left w:val="nil"/>
-              <w:bottom w:val="dotted" w:sz="6" w:space="0" w:color="A0A0A0"/>
-              <w:right w:val="nil"/>
-            </w:tcBorders>
-            <w:vAlign w:val="center"/>
-          </w:tcPr>
-          <w:p>
-            <w:pPr>
-              <w:pStyle w:val="a7"/>
-              <w:spacing w:line="240" w:lineRule="auto"/>
-              <w:ind w:left="100" w:right="100"/>
-              <w:rPr>
-                <w:rFonts w:ascii="Malgun Gothic" w:eastAsia="Malgun Gothic" w:hAnsi="Malgun Gothic"/>
-              </w:rPr>
-            </w:pPr>
-          </w:p>
-        </w:tc>
-      </w:tr>
-      <w:tr>
-        <w:tblPrEx>
-          <w:tblCellMar>
-            <w:top w:w="0" w:type="dxa"/>
-            <w:bottom w:w="0" w:type="dxa"/>
-          </w:tblCellMar>
-        </w:tblPrEx>
-        <w:trPr>
-          <w:trHeight w:hRule="exact" w:val="406"/>
-          <w:jc w:val="center"/>
-        </w:trPr>
-        <w:tc>
-          <w:tcPr>
-            <w:tcW w:w="8985" w:type="dxa"/>
-            <w:gridSpan w:val="4"/>
-            <w:tcBorders>
-              <w:top w:val="dotted" w:sz="6" w:space="0" w:color="A0A0A0"/>
-              <w:left w:val="single" w:sz="6" w:space="0" w:color="EDF0FA"/>
-              <w:bottom w:val="dotted" w:sz="6" w:space="0" w:color="A0A0A0"/>
-              <w:right w:val="single" w:sz="6" w:space="0" w:color="EDF0FA"/>
-            </w:tcBorders>
-            <w:shd w:val="solid" w:color="EDF0FA" w:fill="auto"/>
-            <w:vAlign w:val="center"/>
-          </w:tcPr>
-          <w:p>
-            <w:pPr>
-              <w:pStyle w:val="a7"/>
-              <w:spacing w:line="240" w:lineRule="auto"/>
-              <w:ind w:left="100" w:right="100"/>
-              <w:rPr>
-                <w:rFonts w:ascii="Malgun Gothic" w:eastAsia="Malgun Gothic" w:hAnsi="Malgun Gothic" w:cs="Malgun Gothic"/>
-              </w:rPr>
-            </w:pPr>
-            <w:r>
-              <w:rPr>
-                <w:rFonts w:ascii="Malgun Gothic" w:eastAsia="Malgun Gothic" w:hAnsi="Malgun Gothic" w:cs="Batang" w:hint="eastAsia"/>
-              </w:rPr>
-              <w:t>■</w:t>
-            </w:r>
-            <w:r>
-              <w:rPr>
-                <w:rFonts w:ascii="Malgun Gothic" w:eastAsia="Malgun Gothic" w:hAnsi="Malgun Gothic" w:cs="Malgun Gothic"/>
-              </w:rPr>
-              <w:t xml:space="preserve"> </w:t>
-            </w:r>
-            <w:r>
-              <w:rPr>
-                <w:rFonts w:ascii="Malgun Gothic" w:eastAsia="Malgun Gothic" w:hAnsi="Malgun Gothic" w:cs="Malgun Gothic" w:hint="eastAsia"/>
-              </w:rPr>
-              <w:t>협조사항</w:t>
-            </w:r>
-            <w:r>
-              <w:rPr>
-                <w:rFonts w:ascii="Malgun Gothic" w:eastAsia="Malgun Gothic" w:hAnsi="Malgun Gothic" w:cs="Malgun Gothic"/>
-              </w:rPr>
-              <w:t xml:space="preserve"> </w:t>
-            </w:r>
-            <w:r>
-              <w:rPr>
-                <w:rFonts w:ascii="Malgun Gothic" w:eastAsia="Malgun Gothic" w:hAnsi="Malgun Gothic" w:cs="Malgun Gothic" w:hint="eastAsia"/>
-              </w:rPr>
-              <w:t>및</w:t>
-            </w:r>
-            <w:r>
-              <w:rPr>
-                <w:rFonts w:ascii="Malgun Gothic" w:eastAsia="Malgun Gothic" w:hAnsi="Malgun Gothic" w:cs="Malgun Gothic"/>
-              </w:rPr>
-              <w:t xml:space="preserve"> </w:t>
-            </w:r>
-            <w:r>
-              <w:rPr>
-                <w:rFonts w:ascii="Malgun Gothic" w:eastAsia="Malgun Gothic" w:hAnsi="Malgun Gothic" w:cs="Malgun Gothic" w:hint="eastAsia"/>
-              </w:rPr>
-              <w:t>공유사항</w:t>
-            </w:r>
-          </w:p>
-        </w:tc>
-      </w:tr>
-      <w:tr>
-        <w:tblPrEx>
-          <w:tblCellMar>
-            <w:top w:w="0" w:type="dxa"/>
-            <w:bottom w:w="0" w:type="dxa"/>
-          </w:tblCellMar>
-        </w:tblPrEx>
-        <w:trPr>
-          <w:trHeight w:hRule="exact" w:val="1368"/>
-          <w:jc w:val="center"/>
-        </w:trPr>
-        <w:tc>
-          <w:tcPr>
-            <w:tcW w:w="8985" w:type="dxa"/>
-            <w:gridSpan w:val="4"/>
-            <w:tcBorders>
-              <w:top w:val="dotted" w:sz="6" w:space="0" w:color="A0A0A0"/>
-              <w:left w:val="nil"/>
               <w:bottom w:val="single" w:sz="6" w:space="0" w:color="425FDA"/>
               <w:right w:val="nil"/>
             </w:tcBorders>
@@ -1964,11 +1809,11 @@
           </w:tcPr>
           <w:p>
             <w:pPr>
-              <w:pStyle w:val="a7"/>
+              <w:pStyle w:val="ac"/>
               <w:spacing w:line="240" w:lineRule="auto"/>
               <w:ind w:left="100" w:right="100"/>
               <w:rPr>
-                <w:rFonts w:ascii="Malgun Gothic" w:eastAsia="Malgun Gothic" w:hAnsi="Malgun Gothic"/>
+                <w:rFonts w:ascii="맑은 고딕" w:eastAsia="맑은 고딕" w:hAnsi="맑은 고딕"/>
               </w:rPr>
             </w:pPr>
           </w:p>
@@ -1977,7 +1822,7 @@
     </w:tbl>
     <w:p>
       <w:pPr>
-        <w:pStyle w:val="a"/>
+        <w:pStyle w:val="a3"/>
         <w:ind w:left="100" w:right="100"/>
         <w:rPr>
           <w:sz w:val="2"/>
@@ -1987,7 +1832,7 @@
     </w:p>
     <w:p>
       <w:pPr>
-        <w:pStyle w:val="a7"/>
+        <w:pStyle w:val="ac"/>
         <w:wordWrap/>
         <w:spacing w:line="307" w:lineRule="auto"/>
         <w:jc w:val="center"/>
@@ -2008,7 +1853,7 @@
 </file>
 
 <file path=word/endnotes.xml><?xml version="1.0" encoding="utf-8"?>
-<w:endnotes xmlns:wpc="http://schemas.microsoft.com/office/word/2010/wordprocessingCanvas" xmlns:cx="http://schemas.microsoft.com/office/drawing/2014/chartex" xmlns:cx1="http://schemas.microsoft.com/office/drawing/2015/9/8/chartex" xmlns:cx2="http://schemas.microsoft.com/office/drawing/2015/10/21/chartex" xmlns:cx3="http://schemas.microsoft.com/office/drawing/2016/5/9/chartex" xmlns:cx4="http://schemas.microsoft.com/office/drawing/2016/5/10/chartex" xmlns:cx5="http://schemas.microsoft.com/office/drawing/2016/5/11/chartex" xmlns:cx6="http://schemas.microsoft.com/office/drawing/2016/5/12/chartex" xmlns:cx7="http://schemas.microsoft.com/office/drawing/2016/5/13/chartex" xmlns:cx8="http://schemas.microsoft.com/office/drawing/2016/5/14/chartex" xmlns:mc="http://schemas.openxmlformats.org/markup-compatibility/2006" xmlns:aink="http://schemas.microsoft.com/office/drawing/2016/ink" xmlns:am3d="http://schemas.microsoft.com/office/drawing/2017/model3d" xmlns:o="urn:schemas-microsoft-com:office:office" xmlns:r="http://schemas.openxmlformats.org/officeDocument/2006/relationships" xmlns:m="http://schemas.openxmlformats.org/officeDocument/2006/math" xmlns:v="urn:schemas-microsoft-com:vml" xmlns:wp14="http://schemas.microsoft.com/office/word/2010/wordprocessingDrawing" xmlns:wp="http://schemas.openxmlformats.org/drawingml/2006/wordprocessingDrawing" xmlns:w10="urn:schemas-microsoft-com:office:word" xmlns:w="http://schemas.openxmlformats.org/wordprocessingml/2006/main" xmlns:w14="http://schemas.microsoft.com/office/word/2010/wordml" xmlns:w15="http://schemas.microsoft.com/office/word/2012/wordml" xmlns:w16cex="http://schemas.microsoft.com/office/word/2018/wordml/cex" xmlns:w16cid="http://schemas.microsoft.com/office/word/2016/wordml/cid" xmlns:w16="http://schemas.microsoft.com/office/word/2018/wordml" xmlns:w16sdtdh="http://schemas.microsoft.com/office/word/2020/wordml/sdtdatahash" xmlns:w16se="http://schemas.microsoft.com/office/word/2015/wordml/symex" xmlns:wpg="http://schemas.microsoft.com/office/word/2010/wordprocessingGroup" xmlns:wpi="http://schemas.microsoft.com/office/word/2010/wordprocessingInk" xmlns:wne="http://schemas.microsoft.com/office/word/2006/wordml" xmlns:wps="http://schemas.microsoft.com/office/word/2010/wordprocessingShape" mc:Ignorable="w14 w15 w16se w16cid w16 w16cex w16sdtdh wp14">
+<w:endnotes xmlns:wpc="http://schemas.microsoft.com/office/word/2010/wordprocessingCanvas" xmlns:cx="http://schemas.microsoft.com/office/drawing/2014/chartex" xmlns:cx1="http://schemas.microsoft.com/office/drawing/2015/9/8/chartex" xmlns:cx2="http://schemas.microsoft.com/office/drawing/2015/10/21/chartex" xmlns:cx3="http://schemas.microsoft.com/office/drawing/2016/5/9/chartex" xmlns:cx4="http://schemas.microsoft.com/office/drawing/2016/5/10/chartex" xmlns:cx5="http://schemas.microsoft.com/office/drawing/2016/5/11/chartex" xmlns:cx6="http://schemas.microsoft.com/office/drawing/2016/5/12/chartex" xmlns:cx7="http://schemas.microsoft.com/office/drawing/2016/5/13/chartex" xmlns:cx8="http://schemas.microsoft.com/office/drawing/2016/5/14/chartex" xmlns:mc="http://schemas.openxmlformats.org/markup-compatibility/2006" xmlns:aink="http://schemas.microsoft.com/office/drawing/2016/ink" xmlns:am3d="http://schemas.microsoft.com/office/drawing/2017/model3d" xmlns:o="urn:schemas-microsoft-com:office:office" xmlns:oel="http://schemas.microsoft.com/office/2019/extlst" xmlns:r="http://schemas.openxmlformats.org/officeDocument/2006/relationships" xmlns:m="http://schemas.openxmlformats.org/officeDocument/2006/math" xmlns:v="urn:schemas-microsoft-com:vml" xmlns:wp14="http://schemas.microsoft.com/office/word/2010/wordprocessingDrawing" xmlns:wp="http://schemas.openxmlformats.org/drawingml/2006/wordprocessingDrawing" xmlns:w10="urn:schemas-microsoft-com:office:word" xmlns:w="http://schemas.openxmlformats.org/wordprocessingml/2006/main" xmlns:w14="http://schemas.microsoft.com/office/word/2010/wordml" xmlns:w15="http://schemas.microsoft.com/office/word/2012/wordml" xmlns:w16cex="http://schemas.microsoft.com/office/word/2018/wordml/cex" xmlns:w16cid="http://schemas.microsoft.com/office/word/2016/wordml/cid" xmlns:w16="http://schemas.microsoft.com/office/word/2018/wordml" xmlns:w16du="http://schemas.microsoft.com/office/word/2023/wordml/word16du" xmlns:w16sdtdh="http://schemas.microsoft.com/office/word/2020/wordml/sdtdatahash" xmlns:w16sdtfl="http://schemas.microsoft.com/office/word/2024/wordml/sdtformatlock" xmlns:w16se="http://schemas.microsoft.com/office/word/2015/wordml/symex" xmlns:wpg="http://schemas.microsoft.com/office/word/2010/wordprocessingGroup" xmlns:wpi="http://schemas.microsoft.com/office/word/2010/wordprocessingInk" xmlns:wne="http://schemas.microsoft.com/office/word/2006/wordml" xmlns:wps="http://schemas.microsoft.com/office/word/2010/wordprocessingShape" mc:Ignorable="w14 w15 w16se w16cid w16 w16cex w16sdtdh w16sdtfl w16du wp14">
   <w:endnote w:type="separator" w:id="-1">
     <w:p>
       <w:r>
@@ -2027,7 +1872,7 @@
 </file>
 
 <file path=word/footnotes.xml><?xml version="1.0" encoding="utf-8"?>
-<w:footnotes xmlns:wpc="http://schemas.microsoft.com/office/word/2010/wordprocessingCanvas" xmlns:cx="http://schemas.microsoft.com/office/drawing/2014/chartex" xmlns:cx1="http://schemas.microsoft.com/office/drawing/2015/9/8/chartex" xmlns:cx2="http://schemas.microsoft.com/office/drawing/2015/10/21/chartex" xmlns:cx3="http://schemas.microsoft.com/office/drawing/2016/5/9/chartex" xmlns:cx4="http://schemas.microsoft.com/office/drawing/2016/5/10/chartex" xmlns:cx5="http://schemas.microsoft.com/office/drawing/2016/5/11/chartex" xmlns:cx6="http://schemas.microsoft.com/office/drawing/2016/5/12/chartex" xmlns:cx7="http://schemas.microsoft.com/office/drawing/2016/5/13/chartex" xmlns:cx8="http://schemas.microsoft.com/office/drawing/2016/5/14/chartex" xmlns:mc="http://schemas.openxmlformats.org/markup-compatibility/2006" xmlns:aink="http://schemas.microsoft.com/office/drawing/2016/ink" xmlns:am3d="http://schemas.microsoft.com/office/drawing/2017/model3d" xmlns:o="urn:schemas-microsoft-com:office:office" xmlns:r="http://schemas.openxmlformats.org/officeDocument/2006/relationships" xmlns:m="http://schemas.openxmlformats.org/officeDocument/2006/math" xmlns:v="urn:schemas-microsoft-com:vml" xmlns:wp14="http://schemas.microsoft.com/office/word/2010/wordprocessingDrawing" xmlns:wp="http://schemas.openxmlformats.org/drawingml/2006/wordprocessingDrawing" xmlns:w10="urn:schemas-microsoft-com:office:word" xmlns:w="http://schemas.openxmlformats.org/wordprocessingml/2006/main" xmlns:w14="http://schemas.microsoft.com/office/word/2010/wordml" xmlns:w15="http://schemas.microsoft.com/office/word/2012/wordml" xmlns:w16cex="http://schemas.microsoft.com/office/word/2018/wordml/cex" xmlns:w16cid="http://schemas.microsoft.com/office/word/2016/wordml/cid" xmlns:w16="http://schemas.microsoft.com/office/word/2018/wordml" xmlns:w16sdtdh="http://schemas.microsoft.com/office/word/2020/wordml/sdtdatahash" xmlns:w16se="http://schemas.microsoft.com/office/word/2015/wordml/symex" xmlns:wpg="http://schemas.microsoft.com/office/word/2010/wordprocessingGroup" xmlns:wpi="http://schemas.microsoft.com/office/word/2010/wordprocessingInk" xmlns:wne="http://schemas.microsoft.com/office/word/2006/wordml" xmlns:wps="http://schemas.microsoft.com/office/word/2010/wordprocessingShape" mc:Ignorable="w14 w15 w16se w16cid w16 w16cex w16sdtdh wp14">
+<w:footnotes xmlns:wpc="http://schemas.microsoft.com/office/word/2010/wordprocessingCanvas" xmlns:cx="http://schemas.microsoft.com/office/drawing/2014/chartex" xmlns:cx1="http://schemas.microsoft.com/office/drawing/2015/9/8/chartex" xmlns:cx2="http://schemas.microsoft.com/office/drawing/2015/10/21/chartex" xmlns:cx3="http://schemas.microsoft.com/office/drawing/2016/5/9/chartex" xmlns:cx4="http://schemas.microsoft.com/office/drawing/2016/5/10/chartex" xmlns:cx5="http://schemas.microsoft.com/office/drawing/2016/5/11/chartex" xmlns:cx6="http://schemas.microsoft.com/office/drawing/2016/5/12/chartex" xmlns:cx7="http://schemas.microsoft.com/office/drawing/2016/5/13/chartex" xmlns:cx8="http://schemas.microsoft.com/office/drawing/2016/5/14/chartex" xmlns:mc="http://schemas.openxmlformats.org/markup-compatibility/2006" xmlns:aink="http://schemas.microsoft.com/office/drawing/2016/ink" xmlns:am3d="http://schemas.microsoft.com/office/drawing/2017/model3d" xmlns:o="urn:schemas-microsoft-com:office:office" xmlns:oel="http://schemas.microsoft.com/office/2019/extlst" xmlns:r="http://schemas.openxmlformats.org/officeDocument/2006/relationships" xmlns:m="http://schemas.openxmlformats.org/officeDocument/2006/math" xmlns:v="urn:schemas-microsoft-com:vml" xmlns:wp14="http://schemas.microsoft.com/office/word/2010/wordprocessingDrawing" xmlns:wp="http://schemas.openxmlformats.org/drawingml/2006/wordprocessingDrawing" xmlns:w10="urn:schemas-microsoft-com:office:word" xmlns:w="http://schemas.openxmlformats.org/wordprocessingml/2006/main" xmlns:w14="http://schemas.microsoft.com/office/word/2010/wordml" xmlns:w15="http://schemas.microsoft.com/office/word/2012/wordml" xmlns:w16cex="http://schemas.microsoft.com/office/word/2018/wordml/cex" xmlns:w16cid="http://schemas.microsoft.com/office/word/2016/wordml/cid" xmlns:w16="http://schemas.microsoft.com/office/word/2018/wordml" xmlns:w16du="http://schemas.microsoft.com/office/word/2023/wordml/word16du" xmlns:w16sdtdh="http://schemas.microsoft.com/office/word/2020/wordml/sdtdatahash" xmlns:w16sdtfl="http://schemas.microsoft.com/office/word/2024/wordml/sdtformatlock" xmlns:w16se="http://schemas.microsoft.com/office/word/2015/wordml/symex" xmlns:wpg="http://schemas.microsoft.com/office/word/2010/wordprocessingGroup" xmlns:wpi="http://schemas.microsoft.com/office/word/2010/wordprocessingInk" xmlns:wne="http://schemas.microsoft.com/office/word/2006/wordml" xmlns:wps="http://schemas.microsoft.com/office/word/2010/wordprocessingShape" mc:Ignorable="w14 w15 w16se w16cid w16 w16cex w16sdtdh w16sdtfl w16du wp14">
   <w:footnote w:type="separator" w:id="-1">
     <w:p>
       <w:r>
@@ -2046,12 +1891,12 @@
 </file>
 
 <file path=word/styles.xml><?xml version="1.0" encoding="utf-8"?>
-<w:styles xmlns:mc="http://schemas.openxmlformats.org/markup-compatibility/2006" xmlns:r="http://schemas.openxmlformats.org/officeDocument/2006/relationships" xmlns:w="http://schemas.openxmlformats.org/wordprocessingml/2006/main" xmlns:w14="http://schemas.microsoft.com/office/word/2010/wordml" xmlns:w15="http://schemas.microsoft.com/office/word/2012/wordml" xmlns:w16cex="http://schemas.microsoft.com/office/word/2018/wordml/cex" xmlns:w16cid="http://schemas.microsoft.com/office/word/2016/wordml/cid" xmlns:w16="http://schemas.microsoft.com/office/word/2018/wordml" xmlns:w16sdtdh="http://schemas.microsoft.com/office/word/2020/wordml/sdtdatahash" xmlns:w16se="http://schemas.microsoft.com/office/word/2015/wordml/symex" mc:Ignorable="w14 w15 w16se w16cid w16 w16cex w16sdtdh">
+<w:styles xmlns:mc="http://schemas.openxmlformats.org/markup-compatibility/2006" xmlns:r="http://schemas.openxmlformats.org/officeDocument/2006/relationships" xmlns:w="http://schemas.openxmlformats.org/wordprocessingml/2006/main" xmlns:w14="http://schemas.microsoft.com/office/word/2010/wordml" xmlns:w15="http://schemas.microsoft.com/office/word/2012/wordml" xmlns:w16cex="http://schemas.microsoft.com/office/word/2018/wordml/cex" xmlns:w16cid="http://schemas.microsoft.com/office/word/2016/wordml/cid" xmlns:w16="http://schemas.microsoft.com/office/word/2018/wordml" xmlns:w16du="http://schemas.microsoft.com/office/word/2023/wordml/word16du" xmlns:w16sdtdh="http://schemas.microsoft.com/office/word/2020/wordml/sdtdatahash" xmlns:w16sdtfl="http://schemas.microsoft.com/office/word/2024/wordml/sdtformatlock" xmlns:w16se="http://schemas.microsoft.com/office/word/2015/wordml/symex" mc:Ignorable="w14 w15 w16se w16cid w16 w16cex w16sdtdh w16sdtfl w16du">
   <w:docDefaults>
     <w:rPrDefault>
       <w:rPr>
-        <w:rFonts w:ascii="Times New Roman" w:eastAsia="Batang" w:hAnsi="Times New Roman" w:cs="Times New Roman"/>
-        <w:lang w:val="en-US" w:eastAsia="en-US" w:bidi="ar-SA"/>
+        <w:rFonts w:ascii="Times New Roman" w:eastAsia="바탕" w:hAnsi="Times New Roman" w:cs="Times New Roman"/>
+        <w:lang w:val="en-US" w:eastAsia="ko-KR" w:bidi="ar-SA"/>
       </w:rPr>
     </w:rPrDefault>
     <w:pPrDefault/>
@@ -2072,6 +1917,50 @@
     <w:lsdException w:name="Subtitle" w:qFormat="1"/>
     <w:lsdException w:name="Strong" w:qFormat="1"/>
     <w:lsdException w:name="Emphasis" w:qFormat="1"/>
+    <w:lsdException w:name="Normal Table" w:semiHidden="1" w:unhideWhenUsed="1"/>
+    <w:lsdException w:name="Table Simple 1" w:semiHidden="1" w:unhideWhenUsed="1"/>
+    <w:lsdException w:name="Table Simple 2" w:semiHidden="1" w:unhideWhenUsed="1"/>
+    <w:lsdException w:name="Table Simple 3" w:semiHidden="1" w:unhideWhenUsed="1"/>
+    <w:lsdException w:name="Table Classic 1" w:semiHidden="1" w:unhideWhenUsed="1"/>
+    <w:lsdException w:name="Table Classic 2" w:semiHidden="1" w:unhideWhenUsed="1"/>
+    <w:lsdException w:name="Table Classic 3" w:semiHidden="1" w:unhideWhenUsed="1"/>
+    <w:lsdException w:name="Table Classic 4" w:semiHidden="1" w:unhideWhenUsed="1"/>
+    <w:lsdException w:name="Table Colorful 1" w:semiHidden="1" w:unhideWhenUsed="1"/>
+    <w:lsdException w:name="Table Colorful 2" w:semiHidden="1" w:unhideWhenUsed="1"/>
+    <w:lsdException w:name="Table Colorful 3" w:semiHidden="1" w:unhideWhenUsed="1"/>
+    <w:lsdException w:name="Table Columns 1" w:semiHidden="1" w:unhideWhenUsed="1"/>
+    <w:lsdException w:name="Table Columns 2" w:semiHidden="1" w:unhideWhenUsed="1"/>
+    <w:lsdException w:name="Table Columns 3" w:semiHidden="1" w:unhideWhenUsed="1"/>
+    <w:lsdException w:name="Table Columns 4" w:semiHidden="1" w:unhideWhenUsed="1"/>
+    <w:lsdException w:name="Table Columns 5" w:semiHidden="1" w:unhideWhenUsed="1"/>
+    <w:lsdException w:name="Table Grid 1" w:semiHidden="1" w:unhideWhenUsed="1"/>
+    <w:lsdException w:name="Table Grid 2" w:semiHidden="1" w:unhideWhenUsed="1"/>
+    <w:lsdException w:name="Table Grid 3" w:semiHidden="1" w:unhideWhenUsed="1"/>
+    <w:lsdException w:name="Table Grid 4" w:semiHidden="1" w:unhideWhenUsed="1"/>
+    <w:lsdException w:name="Table Grid 5" w:semiHidden="1" w:unhideWhenUsed="1"/>
+    <w:lsdException w:name="Table Grid 6" w:semiHidden="1" w:unhideWhenUsed="1"/>
+    <w:lsdException w:name="Table Grid 7" w:semiHidden="1" w:unhideWhenUsed="1"/>
+    <w:lsdException w:name="Table Grid 8" w:semiHidden="1" w:unhideWhenUsed="1"/>
+    <w:lsdException w:name="Table List 1" w:semiHidden="1" w:unhideWhenUsed="1"/>
+    <w:lsdException w:name="Table List 2" w:semiHidden="1" w:unhideWhenUsed="1"/>
+    <w:lsdException w:name="Table List 3" w:semiHidden="1" w:unhideWhenUsed="1"/>
+    <w:lsdException w:name="Table List 4" w:semiHidden="1" w:unhideWhenUsed="1"/>
+    <w:lsdException w:name="Table List 5" w:semiHidden="1" w:unhideWhenUsed="1"/>
+    <w:lsdException w:name="Table List 6" w:semiHidden="1" w:unhideWhenUsed="1"/>
+    <w:lsdException w:name="Table List 7" w:semiHidden="1" w:unhideWhenUsed="1"/>
+    <w:lsdException w:name="Table List 8" w:semiHidden="1" w:unhideWhenUsed="1"/>
+    <w:lsdException w:name="Table 3D effects 1" w:semiHidden="1" w:unhideWhenUsed="1"/>
+    <w:lsdException w:name="Table 3D effects 2" w:semiHidden="1" w:unhideWhenUsed="1"/>
+    <w:lsdException w:name="Table 3D effects 3" w:semiHidden="1" w:unhideWhenUsed="1"/>
+    <w:lsdException w:name="Table Contemporary" w:semiHidden="1" w:unhideWhenUsed="1"/>
+    <w:lsdException w:name="Table Elegant" w:semiHidden="1" w:unhideWhenUsed="1"/>
+    <w:lsdException w:name="Table Professional" w:semiHidden="1" w:unhideWhenUsed="1"/>
+    <w:lsdException w:name="Table Subtle 1" w:semiHidden="1" w:unhideWhenUsed="1"/>
+    <w:lsdException w:name="Table Subtle 2" w:semiHidden="1" w:unhideWhenUsed="1"/>
+    <w:lsdException w:name="Table Web 1" w:semiHidden="1" w:unhideWhenUsed="1"/>
+    <w:lsdException w:name="Table Web 2" w:semiHidden="1" w:unhideWhenUsed="1"/>
+    <w:lsdException w:name="Table Web 3" w:semiHidden="1" w:unhideWhenUsed="1"/>
+    <w:lsdException w:name="Table Theme" w:semiHidden="1" w:unhideWhenUsed="1"/>
     <w:lsdException w:name="Placeholder Text" w:semiHidden="1" w:uiPriority="99"/>
     <w:lsdException w:name="No Spacing" w:uiPriority="1" w:qFormat="1"/>
     <w:lsdException w:name="Light Shading" w:uiPriority="60"/>
@@ -2293,7 +2182,7 @@
     <w:lsdException w:name="Unresolved Mention" w:semiHidden="1" w:uiPriority="99" w:unhideWhenUsed="1"/>
     <w:lsdException w:name="Smart Link" w:semiHidden="1" w:uiPriority="99" w:unhideWhenUsed="1"/>
   </w:latentStyles>
-  <w:style w:type="paragraph" w:default="1" w:styleId="Normal">
+  <w:style w:type="paragraph" w:default="1" w:styleId="a">
     <w:name w:val="Normal"/>
     <w:qFormat/>
     <w:pPr>
@@ -2304,19 +2193,22 @@
       <w:jc w:val="both"/>
     </w:pPr>
     <w:rPr>
-      <w:rFonts w:ascii="Batang"/>
+      <w:rFonts w:ascii="바탕"/>
       <w:kern w:val="2"/>
       <w:szCs w:val="24"/>
-      <w:lang w:eastAsia="ko-KR"/>
     </w:rPr>
   </w:style>
-  <w:style w:type="character" w:default="1" w:styleId="DefaultParagraphFont">
+  <w:style w:type="character" w:default="1" w:styleId="a0">
     <w:name w:val="Default Paragraph Font"/>
+    <w:uiPriority w:val="1"/>
     <w:semiHidden/>
+    <w:unhideWhenUsed/>
   </w:style>
-  <w:style w:type="table" w:default="1" w:styleId="TableNormal">
+  <w:style w:type="table" w:default="1" w:styleId="a1">
     <w:name w:val="Normal Table"/>
+    <w:uiPriority w:val="99"/>
     <w:semiHidden/>
+    <w:unhideWhenUsed/>
     <w:tblPr>
       <w:tblInd w:w="0" w:type="dxa"/>
       <w:tblCellMar>
@@ -2327,11 +2219,13 @@
       </w:tblCellMar>
     </w:tblPr>
   </w:style>
-  <w:style w:type="numbering" w:default="1" w:styleId="NoList">
+  <w:style w:type="numbering" w:default="1" w:styleId="a2">
     <w:name w:val="No List"/>
+    <w:uiPriority w:val="99"/>
     <w:semiHidden/>
+    <w:unhideWhenUsed/>
   </w:style>
-  <w:style w:type="paragraph" w:customStyle="1" w:styleId="a">
+  <w:style w:type="paragraph" w:customStyle="1" w:styleId="a3">
     <w:name w:val="바탕글"/>
     <w:pPr>
       <w:widowControl w:val="0"/>
@@ -2377,14 +2271,13 @@
       <w:jc w:val="both"/>
     </w:pPr>
     <w:rPr>
-      <w:rFonts w:ascii="Batang"/>
+      <w:rFonts w:ascii="바탕"/>
       <w:color w:val="000000"/>
-      <w:lang w:eastAsia="ko-KR"/>
     </w:rPr>
   </w:style>
-  <w:style w:type="paragraph" w:styleId="BodyText">
+  <w:style w:type="paragraph" w:styleId="a4">
     <w:name w:val="Body Text"/>
-    <w:basedOn w:val="Normal"/>
+    <w:basedOn w:val="a"/>
     <w:pPr>
       <w:tabs>
         <w:tab w:val="left" w:pos="800"/>
@@ -2477,9 +2370,8 @@
       <w:jc w:val="both"/>
     </w:pPr>
     <w:rPr>
-      <w:rFonts w:ascii="Batang"/>
+      <w:rFonts w:ascii="바탕"/>
       <w:color w:val="000000"/>
-      <w:lang w:eastAsia="ko-KR"/>
     </w:rPr>
   </w:style>
   <w:style w:type="paragraph" w:customStyle="1" w:styleId="2">
@@ -2529,9 +2421,8 @@
       <w:jc w:val="both"/>
     </w:pPr>
     <w:rPr>
-      <w:rFonts w:ascii="Batang"/>
+      <w:rFonts w:ascii="바탕"/>
       <w:color w:val="000000"/>
-      <w:lang w:eastAsia="ko-KR"/>
     </w:rPr>
   </w:style>
   <w:style w:type="paragraph" w:customStyle="1" w:styleId="3">
@@ -2581,9 +2472,8 @@
       <w:jc w:val="both"/>
     </w:pPr>
     <w:rPr>
-      <w:rFonts w:ascii="Batang"/>
+      <w:rFonts w:ascii="바탕"/>
       <w:color w:val="000000"/>
-      <w:lang w:eastAsia="ko-KR"/>
     </w:rPr>
   </w:style>
   <w:style w:type="paragraph" w:customStyle="1" w:styleId="4">
@@ -2633,9 +2523,8 @@
       <w:jc w:val="both"/>
     </w:pPr>
     <w:rPr>
-      <w:rFonts w:ascii="Batang"/>
+      <w:rFonts w:ascii="바탕"/>
       <w:color w:val="000000"/>
-      <w:lang w:eastAsia="ko-KR"/>
     </w:rPr>
   </w:style>
   <w:style w:type="paragraph" w:customStyle="1" w:styleId="5">
@@ -2685,9 +2574,8 @@
       <w:jc w:val="both"/>
     </w:pPr>
     <w:rPr>
-      <w:rFonts w:ascii="Batang"/>
+      <w:rFonts w:ascii="바탕"/>
       <w:color w:val="000000"/>
-      <w:lang w:eastAsia="ko-KR"/>
     </w:rPr>
   </w:style>
   <w:style w:type="paragraph" w:customStyle="1" w:styleId="6">
@@ -2737,9 +2625,8 @@
       <w:jc w:val="both"/>
     </w:pPr>
     <w:rPr>
-      <w:rFonts w:ascii="Batang"/>
+      <w:rFonts w:ascii="바탕"/>
       <w:color w:val="000000"/>
-      <w:lang w:eastAsia="ko-KR"/>
     </w:rPr>
   </w:style>
   <w:style w:type="paragraph" w:customStyle="1" w:styleId="7">
@@ -2789,12 +2676,11 @@
       <w:jc w:val="both"/>
     </w:pPr>
     <w:rPr>
-      <w:rFonts w:ascii="Batang"/>
+      <w:rFonts w:ascii="바탕"/>
       <w:color w:val="000000"/>
-      <w:lang w:eastAsia="ko-KR"/>
     </w:rPr>
   </w:style>
-  <w:style w:type="paragraph" w:customStyle="1" w:styleId="a0">
+  <w:style w:type="paragraph" w:customStyle="1" w:styleId="a5">
     <w:name w:val="쪽 번호"/>
     <w:pPr>
       <w:widowControl w:val="0"/>
@@ -2840,12 +2726,11 @@
       <w:jc w:val="both"/>
     </w:pPr>
     <w:rPr>
-      <w:rFonts w:ascii="Batang"/>
+      <w:rFonts w:ascii="바탕"/>
       <w:color w:val="000000"/>
-      <w:lang w:eastAsia="ko-KR"/>
     </w:rPr>
   </w:style>
-  <w:style w:type="paragraph" w:customStyle="1" w:styleId="a1">
+  <w:style w:type="paragraph" w:customStyle="1" w:styleId="a6">
     <w:name w:val="머리말"/>
     <w:pPr>
       <w:widowControl w:val="0"/>
@@ -2879,14 +2764,13 @@
       <w:jc w:val="right"/>
     </w:pPr>
     <w:rPr>
-      <w:rFonts w:ascii="Batang"/>
+      <w:rFonts w:ascii="바탕"/>
       <w:color w:val="000000"/>
       <w:sz w:val="18"/>
       <w:szCs w:val="18"/>
-      <w:lang w:eastAsia="ko-KR"/>
     </w:rPr>
   </w:style>
-  <w:style w:type="paragraph" w:customStyle="1" w:styleId="a2">
+  <w:style w:type="paragraph" w:customStyle="1" w:styleId="a7">
     <w:name w:val="각주"/>
     <w:pPr>
       <w:widowControl w:val="0"/>
@@ -2932,14 +2816,13 @@
       <w:jc w:val="both"/>
     </w:pPr>
     <w:rPr>
-      <w:rFonts w:ascii="Batang"/>
+      <w:rFonts w:ascii="바탕"/>
       <w:color w:val="000000"/>
       <w:sz w:val="18"/>
       <w:szCs w:val="18"/>
-      <w:lang w:eastAsia="ko-KR"/>
     </w:rPr>
   </w:style>
-  <w:style w:type="paragraph" w:customStyle="1" w:styleId="a3">
+  <w:style w:type="paragraph" w:customStyle="1" w:styleId="a8">
     <w:name w:val="그림캡션"/>
     <w:pPr>
       <w:widowControl w:val="0"/>
@@ -2985,14 +2868,13 @@
       <w:jc w:val="both"/>
     </w:pPr>
     <w:rPr>
-      <w:rFonts w:ascii="Batang"/>
+      <w:rFonts w:ascii="바탕"/>
       <w:color w:val="000000"/>
       <w:sz w:val="18"/>
       <w:szCs w:val="18"/>
-      <w:lang w:eastAsia="ko-KR"/>
     </w:rPr>
   </w:style>
-  <w:style w:type="paragraph" w:customStyle="1" w:styleId="a4">
+  <w:style w:type="paragraph" w:customStyle="1" w:styleId="a9">
     <w:name w:val="표캡션"/>
     <w:pPr>
       <w:widowControl w:val="0"/>
@@ -3038,14 +2920,13 @@
       <w:jc w:val="both"/>
     </w:pPr>
     <w:rPr>
-      <w:rFonts w:ascii="Batang"/>
+      <w:rFonts w:ascii="바탕"/>
       <w:color w:val="000000"/>
       <w:sz w:val="18"/>
       <w:szCs w:val="18"/>
-      <w:lang w:eastAsia="ko-KR"/>
     </w:rPr>
   </w:style>
-  <w:style w:type="paragraph" w:customStyle="1" w:styleId="a5">
+  <w:style w:type="paragraph" w:customStyle="1" w:styleId="aa">
     <w:name w:val="수식캡션"/>
     <w:pPr>
       <w:widowControl w:val="0"/>
@@ -3091,14 +2972,13 @@
       <w:jc w:val="both"/>
     </w:pPr>
     <w:rPr>
-      <w:rFonts w:ascii="Batang"/>
+      <w:rFonts w:ascii="바탕"/>
       <w:color w:val="000000"/>
       <w:sz w:val="18"/>
       <w:szCs w:val="18"/>
-      <w:lang w:eastAsia="ko-KR"/>
     </w:rPr>
   </w:style>
-  <w:style w:type="paragraph" w:customStyle="1" w:styleId="a6">
+  <w:style w:type="paragraph" w:customStyle="1" w:styleId="ab">
     <w:name w:val="찾아보기"/>
     <w:pPr>
       <w:widowControl w:val="0"/>
@@ -3114,14 +2994,13 @@
       <w:jc w:val="both"/>
     </w:pPr>
     <w:rPr>
-      <w:rFonts w:ascii="Batang"/>
+      <w:rFonts w:ascii="바탕"/>
       <w:color w:val="000000"/>
       <w:sz w:val="18"/>
       <w:szCs w:val="18"/>
-      <w:lang w:eastAsia="ko-KR"/>
     </w:rPr>
   </w:style>
-  <w:style w:type="paragraph" w:customStyle="1" w:styleId="a7">
+  <w:style w:type="paragraph" w:customStyle="1" w:styleId="ac">
     <w:name w:val="예스폼"/>
     <w:pPr>
       <w:widowControl w:val="0"/>
@@ -3167,16 +3046,15 @@
       <w:jc w:val="both"/>
     </w:pPr>
     <w:rPr>
-      <w:rFonts w:ascii="Batang"/>
+      <w:rFonts w:ascii="바탕"/>
       <w:color w:val="000000"/>
       <w:sz w:val="18"/>
       <w:szCs w:val="18"/>
-      <w:lang w:eastAsia="ko-KR"/>
     </w:rPr>
   </w:style>
-  <w:style w:type="paragraph" w:styleId="Header">
+  <w:style w:type="paragraph" w:styleId="ad">
     <w:name w:val="header"/>
-    <w:basedOn w:val="Normal"/>
+    <w:basedOn w:val="a"/>
     <w:rsid w:val="00462B7C"/>
     <w:pPr>
       <w:tabs>
@@ -3186,9 +3064,9 @@
       <w:snapToGrid w:val="0"/>
     </w:pPr>
   </w:style>
-  <w:style w:type="paragraph" w:styleId="Footer">
+  <w:style w:type="paragraph" w:styleId="ae">
     <w:name w:val="footer"/>
-    <w:basedOn w:val="Normal"/>
+    <w:basedOn w:val="a"/>
     <w:rsid w:val="00462B7C"/>
     <w:pPr>
       <w:tabs>
@@ -3198,18 +3076,16 @@
       <w:snapToGrid w:val="0"/>
     </w:pPr>
   </w:style>
-  <w:style w:type="character" w:styleId="Hyperlink">
+  <w:style w:type="character" w:styleId="af">
     <w:name w:val="Hyperlink"/>
-    <w:basedOn w:val="DefaultParagraphFont"/>
     <w:rsid w:val="00AE4E40"/>
     <w:rPr>
       <w:color w:val="0000FF"/>
       <w:u w:val="single"/>
     </w:rPr>
   </w:style>
-  <w:style w:type="character" w:styleId="FollowedHyperlink">
+  <w:style w:type="character" w:styleId="af0">
     <w:name w:val="FollowedHyperlink"/>
-    <w:basedOn w:val="DefaultParagraphFont"/>
     <w:rsid w:val="006123DA"/>
     <w:rPr>
       <w:color w:val="800080"/>

</xml_diff>